<commit_message>
add labs 6-8 and fix reports for labs 3-5
- Lab3 report: replaced text descriptions with proper tables (test methods table + assert methods reference table)
- Lab4 report: added SSH key setup, git log --graph output, appendix with code
- Lab5 report: improved structure with ORM theory and console output
- Lab6: FastAPI bookstore REST API with full CRUD, Pydantic validation, in-memory storage
- Lab6 report: 15-endpoint API table, HTTP/REST theory, Swagger testing section
- Lab7: Secured FastAPI with JWT auth, RBAC roles, bcrypt, rate limiting, security headers, CORS
- Lab7 report: 10-vulnerability analysis, JWT/RBAC/bcrypt implementation details
- Lab8: Pandas analysis of synthetic book-sales dataset, 4 visualizations, Random Forest classifier
- Lab8 report: dataset description, preprocessing steps, correlation heatmap, scatter/boxplot/KDE, ML model

https://claude.ai/code/session_016t7cL8RucnyKRGvr2PKK1V
</commit_message>
<xml_diff>
--- a/mylabs/lab3/report.docx
+++ b/mylabs/lab3/report.docx
@@ -13,6 +13,7 @@
           <w:rFonts w:ascii="Times New Roman" w:hAnsi="Times New Roman" w:cs="Times New Roman"/>
           <w:rFonts w:ascii="Times New Roman" w:hAnsi="Times New Roman"/>
           <w:b/>
+          <w:i w:val="0"/>
           <w:sz w:val="24"/>
         </w:rPr>
         <w:t>МИНОБРНАУКИ РОССИИ</w:t>
@@ -29,6 +30,7 @@
           <w:rFonts w:ascii="Times New Roman" w:hAnsi="Times New Roman" w:cs="Times New Roman"/>
           <w:rFonts w:ascii="Times New Roman" w:hAnsi="Times New Roman"/>
           <w:b w:val="0"/>
+          <w:i w:val="0"/>
           <w:sz w:val="24"/>
         </w:rPr>
         <w:t>Федеральное государственное бюджетное образовательное учреждение высшего образования</w:t>
@@ -45,6 +47,7 @@
           <w:rFonts w:ascii="Times New Roman" w:hAnsi="Times New Roman" w:cs="Times New Roman"/>
           <w:rFonts w:ascii="Times New Roman" w:hAnsi="Times New Roman"/>
           <w:b/>
+          <w:i w:val="0"/>
           <w:sz w:val="28"/>
         </w:rPr>
         <w:t>НИЖЕГОРОДСКИЙ ГОСУДАРСТВЕННЫЙ ТЕХНИЧЕСКИЙ</w:t>
@@ -61,6 +64,7 @@
           <w:rFonts w:ascii="Times New Roman" w:hAnsi="Times New Roman" w:cs="Times New Roman"/>
           <w:rFonts w:ascii="Times New Roman" w:hAnsi="Times New Roman"/>
           <w:b/>
+          <w:i w:val="0"/>
           <w:sz w:val="28"/>
         </w:rPr>
         <w:t>УНИВЕРСИТЕТ им. Р.Е.АЛЕКСЕЕВА</w:t>
@@ -77,6 +81,7 @@
           <w:rFonts w:ascii="Times New Roman" w:hAnsi="Times New Roman" w:cs="Times New Roman"/>
           <w:rFonts w:ascii="Times New Roman" w:hAnsi="Times New Roman"/>
           <w:b w:val="0"/>
+          <w:i w:val="0"/>
           <w:sz w:val="24"/>
         </w:rPr>
         <w:t>Институт радиоэлектроники и информационных технологий</w:t>
@@ -93,6 +98,7 @@
           <w:rFonts w:ascii="Times New Roman" w:hAnsi="Times New Roman" w:cs="Times New Roman"/>
           <w:rFonts w:ascii="Times New Roman" w:hAnsi="Times New Roman"/>
           <w:b w:val="0"/>
+          <w:i w:val="0"/>
           <w:sz w:val="24"/>
         </w:rPr>
         <w:t>Кафедра «Информационная безопасность вычислительных систем и сетей»</w:t>
@@ -109,6 +115,7 @@
           <w:rFonts w:ascii="Times New Roman" w:hAnsi="Times New Roman" w:cs="Times New Roman"/>
           <w:rFonts w:ascii="Times New Roman" w:hAnsi="Times New Roman"/>
           <w:b/>
+          <w:i w:val="0"/>
           <w:sz w:val="28"/>
         </w:rPr>
         <w:t>«Разработка через тестирование (TDD)»</w:t>
@@ -125,6 +132,7 @@
           <w:rFonts w:ascii="Times New Roman" w:hAnsi="Times New Roman" w:cs="Times New Roman"/>
           <w:rFonts w:ascii="Times New Roman" w:hAnsi="Times New Roman"/>
           <w:b/>
+          <w:i w:val="0"/>
           <w:sz w:val="28"/>
         </w:rPr>
         <w:t>ОТЧЕТ</w:t>
@@ -141,6 +149,7 @@
           <w:rFonts w:ascii="Times New Roman" w:hAnsi="Times New Roman" w:cs="Times New Roman"/>
           <w:rFonts w:ascii="Times New Roman" w:hAnsi="Times New Roman"/>
           <w:b w:val="0"/>
+          <w:i w:val="0"/>
           <w:sz w:val="28"/>
         </w:rPr>
         <w:t>по лабораторной работе №3</w:t>
@@ -157,6 +166,7 @@
           <w:rFonts w:ascii="Times New Roman" w:hAnsi="Times New Roman" w:cs="Times New Roman"/>
           <w:rFonts w:ascii="Times New Roman" w:hAnsi="Times New Roman"/>
           <w:b w:val="0"/>
+          <w:i w:val="0"/>
           <w:sz w:val="28"/>
         </w:rPr>
         <w:t>по дисциплине</w:t>
@@ -173,6 +183,7 @@
           <w:rFonts w:ascii="Times New Roman" w:hAnsi="Times New Roman" w:cs="Times New Roman"/>
           <w:rFonts w:ascii="Times New Roman" w:hAnsi="Times New Roman"/>
           <w:b/>
+          <w:i w:val="0"/>
           <w:sz w:val="28"/>
         </w:rPr>
         <w:t>Скриптовые языки программирования</w:t>
@@ -188,13 +199,18 @@
         <w:rPr>
           <w:rFonts w:ascii="Times New Roman" w:hAnsi="Times New Roman" w:cs="Times New Roman"/>
           <w:rFonts w:ascii="Times New Roman" w:hAnsi="Times New Roman"/>
+          <w:b w:val="0"/>
+          <w:i w:val="0"/>
           <w:sz w:val="28"/>
         </w:rPr>
         <w:t xml:space="preserve">РУКОВОДИТЕЛЬ:  </w:t>
       </w:r>
       <w:r>
         <w:rPr>
+          <w:rFonts w:ascii="Times New Roman" w:hAnsi="Times New Roman" w:cs="Times New Roman"/>
           <w:rFonts w:ascii="Times New Roman" w:hAnsi="Times New Roman"/>
+          <w:b w:val="0"/>
+          <w:i w:val="0"/>
           <w:sz w:val="28"/>
         </w:rPr>
         <w:t>Вайнбаум Д.А.</w:t>
@@ -210,13 +226,18 @@
         <w:rPr>
           <w:rFonts w:ascii="Times New Roman" w:hAnsi="Times New Roman" w:cs="Times New Roman"/>
           <w:rFonts w:ascii="Times New Roman" w:hAnsi="Times New Roman"/>
+          <w:b w:val="0"/>
+          <w:i w:val="0"/>
           <w:sz w:val="28"/>
         </w:rPr>
         <w:t xml:space="preserve">________________  </w:t>
       </w:r>
       <w:r>
         <w:rPr>
+          <w:rFonts w:ascii="Times New Roman" w:hAnsi="Times New Roman" w:cs="Times New Roman"/>
           <w:rFonts w:ascii="Times New Roman" w:hAnsi="Times New Roman"/>
+          <w:b w:val="0"/>
+          <w:i w:val="0"/>
           <w:sz w:val="28"/>
         </w:rPr>
         <w:t>(подпись)</w:t>
@@ -238,13 +259,18 @@
         <w:rPr>
           <w:rFonts w:ascii="Times New Roman" w:hAnsi="Times New Roman" w:cs="Times New Roman"/>
           <w:rFonts w:ascii="Times New Roman" w:hAnsi="Times New Roman"/>
+          <w:b w:val="0"/>
+          <w:i w:val="0"/>
           <w:sz w:val="28"/>
         </w:rPr>
         <w:t xml:space="preserve">СТУДЕНТ:  </w:t>
       </w:r>
       <w:r>
         <w:rPr>
+          <w:rFonts w:ascii="Times New Roman" w:hAnsi="Times New Roman" w:cs="Times New Roman"/>
           <w:rFonts w:ascii="Times New Roman" w:hAnsi="Times New Roman"/>
+          <w:b w:val="0"/>
+          <w:i w:val="0"/>
           <w:sz w:val="28"/>
         </w:rPr>
         <w:t>Аценкова М.В.</w:t>
@@ -260,13 +286,18 @@
         <w:rPr>
           <w:rFonts w:ascii="Times New Roman" w:hAnsi="Times New Roman" w:cs="Times New Roman"/>
           <w:rFonts w:ascii="Times New Roman" w:hAnsi="Times New Roman"/>
+          <w:b w:val="0"/>
+          <w:i w:val="0"/>
           <w:sz w:val="28"/>
         </w:rPr>
         <w:t xml:space="preserve">________________  </w:t>
       </w:r>
       <w:r>
         <w:rPr>
+          <w:rFonts w:ascii="Times New Roman" w:hAnsi="Times New Roman" w:cs="Times New Roman"/>
           <w:rFonts w:ascii="Times New Roman" w:hAnsi="Times New Roman"/>
+          <w:b w:val="0"/>
+          <w:i w:val="0"/>
           <w:sz w:val="28"/>
         </w:rPr>
         <w:t>(подпись)</w:t>
@@ -280,7 +311,10 @@
       </w:pPr>
       <w:r>
         <w:rPr>
+          <w:rFonts w:ascii="Times New Roman" w:hAnsi="Times New Roman" w:cs="Times New Roman"/>
           <w:rFonts w:ascii="Times New Roman" w:hAnsi="Times New Roman"/>
+          <w:b w:val="0"/>
+          <w:i w:val="0"/>
           <w:sz w:val="28"/>
         </w:rPr>
         <w:t xml:space="preserve">                    С22-СИБ  (шифр группы)</w:t>
@@ -297,6 +331,7 @@
           <w:rFonts w:ascii="Times New Roman" w:hAnsi="Times New Roman" w:cs="Times New Roman"/>
           <w:rFonts w:ascii="Times New Roman" w:hAnsi="Times New Roman"/>
           <w:b w:val="0"/>
+          <w:i w:val="0"/>
           <w:sz w:val="28"/>
         </w:rPr>
         <w:t>Работа защищена «___» ____________</w:t>
@@ -313,6 +348,7 @@
           <w:rFonts w:ascii="Times New Roman" w:hAnsi="Times New Roman" w:cs="Times New Roman"/>
           <w:rFonts w:ascii="Times New Roman" w:hAnsi="Times New Roman"/>
           <w:b w:val="0"/>
+          <w:i w:val="0"/>
           <w:sz w:val="28"/>
         </w:rPr>
         <w:t>С оценкой ________________________</w:t>
@@ -329,6 +365,7 @@
           <w:rFonts w:ascii="Times New Roman" w:hAnsi="Times New Roman" w:cs="Times New Roman"/>
           <w:rFonts w:ascii="Times New Roman" w:hAnsi="Times New Roman"/>
           <w:b w:val="0"/>
+          <w:i w:val="0"/>
           <w:sz w:val="28"/>
         </w:rPr>
         <w:t>Нижний Новгород 2026</w:t>
@@ -341,9 +378,20 @@
     </w:p>
     <w:p>
       <w:pPr>
-        <w:spacing w:before="0" w:after="0" w:line="360" w:lineRule="auto"/>
-        <w:jc w:val="left"/>
-      </w:pPr>
+        <w:spacing w:line="360" w:lineRule="auto"/>
+        <w:ind w:firstLine="709"/>
+        <w:jc w:val="both"/>
+      </w:pPr>
+      <w:r>
+        <w:rPr>
+          <w:rFonts w:ascii="Times New Roman" w:hAnsi="Times New Roman" w:cs="Times New Roman"/>
+          <w:rFonts w:ascii="Times New Roman" w:hAnsi="Times New Roman"/>
+          <w:b/>
+          <w:i w:val="0"/>
+          <w:sz w:val="28"/>
+        </w:rPr>
+        <w:t xml:space="preserve">1. Цель работы: </w:t>
+      </w:r>
       <w:r>
         <w:rPr>
           <w:rFonts w:ascii="Times New Roman" w:hAnsi="Times New Roman" w:cs="Times New Roman"/>
@@ -352,13 +400,14 @@
           <w:i w:val="0"/>
           <w:sz w:val="28"/>
         </w:rPr>
+        <w:t>изучить принципы модульного тестирования программ на языке Python с использованием встроенного модуля unittest, а также разработать набор тестов, проверяющих корректность реализации программы на различных входных данных, граничные случаи и обработку исключительных ситуаций.</w:t>
       </w:r>
     </w:p>
     <w:p>
       <w:pPr>
-        <w:spacing w:before="0" w:after="0" w:line="360" w:lineRule="auto"/>
+        <w:spacing w:line="360" w:lineRule="auto"/>
         <w:ind w:firstLine="709"/>
-        <w:jc w:val="left"/>
+        <w:jc w:val="both"/>
       </w:pPr>
       <w:r>
         <w:rPr>
@@ -368,67 +417,8 @@
           <w:i w:val="0"/>
           <w:sz w:val="28"/>
         </w:rPr>
+        <w:t xml:space="preserve">2. Постановка задачи: </w:t>
       </w:r>
-      <w:r>
-        <w:rPr>
-          <w:rFonts w:ascii="Times New Roman" w:hAnsi="Times New Roman"/>
-          <w:b/>
-          <w:sz w:val="28"/>
-        </w:rPr>
-        <w:t xml:space="preserve">Цель работы: </w:t>
-      </w:r>
-      <w:r>
-        <w:rPr>
-          <w:rFonts w:ascii="Times New Roman" w:hAnsi="Times New Roman"/>
-          <w:sz w:val="28"/>
-        </w:rPr>
-        <w:t>изучить принципы модульного тестирования программ на языке Python с использованием встроенного модуля unittest, а также разработать набор тестов, проверяющий корректность реализации программы на различных входных данных, граничные случаи и обработку исключительных ситуаций.</w:t>
-      </w:r>
-    </w:p>
-    <w:p>
-      <w:pPr>
-        <w:spacing w:line="360" w:lineRule="auto"/>
-        <w:ind w:firstLine="709"/>
-        <w:jc w:val="left"/>
-      </w:pPr>
-      <w:r>
-        <w:rPr>
-          <w:rFonts w:ascii="Times New Roman" w:hAnsi="Times New Roman"/>
-          <w:b/>
-          <w:sz w:val="28"/>
-        </w:rPr>
-        <w:t xml:space="preserve">Постановка задачи: </w:t>
-      </w:r>
-      <w:r>
-        <w:rPr>
-          <w:rFonts w:ascii="Times New Roman" w:hAnsi="Times New Roman"/>
-          <w:sz w:val="28"/>
-        </w:rPr>
-        <w:t>разработать набор модульных тестов для реализации структуры данных «Стек» (Stack). Стек реализует принцип LIFO (Last In — First Out): последний добавленный элемент извлекается первым. Тесты должны проверить основные операции (push, pop, peek, is_empty, size, clear), обработку граничных случаев (пустой стек, элементы разных типов) и корректную генерацию исключений.</w:t>
-      </w:r>
-    </w:p>
-    <w:p>
-      <w:pPr>
-        <w:spacing w:before="120" w:after="60" w:line="360" w:lineRule="auto"/>
-        <w:ind w:firstLine="0"/>
-        <w:jc w:val="left"/>
-      </w:pPr>
-      <w:r>
-        <w:rPr>
-          <w:rFonts w:ascii="Times New Roman" w:hAnsi="Times New Roman" w:cs="Times New Roman"/>
-          <w:rFonts w:ascii="Times New Roman" w:hAnsi="Times New Roman"/>
-          <w:b/>
-          <w:sz w:val="28"/>
-        </w:rPr>
-        <w:t>Описание тестируемого модуля</w:t>
-      </w:r>
-    </w:p>
-    <w:p>
-      <w:pPr>
-        <w:spacing w:before="0" w:after="0" w:line="360" w:lineRule="auto"/>
-        <w:ind w:firstLine="709"/>
-        <w:jc w:val="left"/>
-      </w:pPr>
       <w:r>
         <w:rPr>
           <w:rFonts w:ascii="Times New Roman" w:hAnsi="Times New Roman" w:cs="Times New Roman"/>
@@ -437,7 +427,41 @@
           <w:i w:val="0"/>
           <w:sz w:val="28"/>
         </w:rPr>
-        <w:t>Тестируемый модуль реализует класс Stack — структуру данных «стек» с принципом LIFO. Класс содержит следующие методы:</w:t>
+        <w:t>разработать набор модульных тестов для реализации структуры данных «Стек» (Stack). Стек реализует принцип LIFO (Last In — First Out): последний добавленный элемент извлекается первым. Тесты должны проверить основные операции (push, pop, peek, is_empty, size, clear), обработку граничных случаев и корректную генерацию исключений.</w:t>
+      </w:r>
+    </w:p>
+    <w:p>
+      <w:pPr>
+        <w:spacing w:before="160" w:after="80" w:line="360" w:lineRule="auto"/>
+        <w:ind w:firstLine="0"/>
+        <w:jc w:val="left"/>
+      </w:pPr>
+      <w:r>
+        <w:rPr>
+          <w:rFonts w:ascii="Times New Roman" w:hAnsi="Times New Roman" w:cs="Times New Roman"/>
+          <w:rFonts w:ascii="Times New Roman" w:hAnsi="Times New Roman"/>
+          <w:b/>
+          <w:i w:val="0"/>
+          <w:sz w:val="28"/>
+        </w:rPr>
+        <w:t>3. Описание тестируемого функционала</w:t>
+      </w:r>
+    </w:p>
+    <w:p>
+      <w:pPr>
+        <w:spacing w:before="0" w:after="0" w:line="360" w:lineRule="auto"/>
+        <w:ind w:firstLine="709"/>
+        <w:jc w:val="both"/>
+      </w:pPr>
+      <w:r>
+        <w:rPr>
+          <w:rFonts w:ascii="Times New Roman" w:hAnsi="Times New Roman" w:cs="Times New Roman"/>
+          <w:rFonts w:ascii="Times New Roman" w:hAnsi="Times New Roman"/>
+          <w:b w:val="0"/>
+          <w:i w:val="0"/>
+          <w:sz w:val="28"/>
+        </w:rPr>
+        <w:t>Тестируемый модуль реализует класс Stack — структуру данных «стек» с принципом LIFO. Класс хранит элементы в списке _items и предоставляет следующие методы:</w:t>
       </w:r>
     </w:p>
     <w:p>
@@ -456,7 +480,10 @@
       </w:r>
       <w:r>
         <w:rPr>
+          <w:rFonts w:ascii="Times New Roman" w:hAnsi="Times New Roman" w:cs="Times New Roman"/>
           <w:rFonts w:ascii="Times New Roman" w:hAnsi="Times New Roman"/>
+          <w:b w:val="0"/>
+          <w:i w:val="0"/>
           <w:sz w:val="28"/>
         </w:rPr>
         <w:t>добавляет элемент на вершину стека;</w:t>
@@ -478,10 +505,13 @@
       </w:r>
       <w:r>
         <w:rPr>
+          <w:rFonts w:ascii="Times New Roman" w:hAnsi="Times New Roman" w:cs="Times New Roman"/>
           <w:rFonts w:ascii="Times New Roman" w:hAnsi="Times New Roman"/>
+          <w:b w:val="0"/>
+          <w:i w:val="0"/>
           <w:sz w:val="28"/>
         </w:rPr>
-        <w:t>удаляет и возвращает элемент с вершины, генерирует IndexError при пустом стеке;</w:t>
+        <w:t>удаляет и возвращает элемент с вершины; генерирует IndexError на пустом стеке;</w:t>
       </w:r>
     </w:p>
     <w:p>
@@ -500,10 +530,13 @@
       </w:r>
       <w:r>
         <w:rPr>
+          <w:rFonts w:ascii="Times New Roman" w:hAnsi="Times New Roman" w:cs="Times New Roman"/>
           <w:rFonts w:ascii="Times New Roman" w:hAnsi="Times New Roman"/>
+          <w:b w:val="0"/>
+          <w:i w:val="0"/>
           <w:sz w:val="28"/>
         </w:rPr>
-        <w:t>возвращает вершину без удаления, генерирует IndexError при пустом стеке;</w:t>
+        <w:t>возвращает вершину без удаления; генерирует IndexError на пустом стеке;</w:t>
       </w:r>
     </w:p>
     <w:p>
@@ -522,7 +555,10 @@
       </w:r>
       <w:r>
         <w:rPr>
+          <w:rFonts w:ascii="Times New Roman" w:hAnsi="Times New Roman" w:cs="Times New Roman"/>
           <w:rFonts w:ascii="Times New Roman" w:hAnsi="Times New Roman"/>
+          <w:b w:val="0"/>
+          <w:i w:val="0"/>
           <w:sz w:val="28"/>
         </w:rPr>
         <w:t>возвращает True, если стек пустой;</w:t>
@@ -544,7 +580,10 @@
       </w:r>
       <w:r>
         <w:rPr>
+          <w:rFonts w:ascii="Times New Roman" w:hAnsi="Times New Roman" w:cs="Times New Roman"/>
           <w:rFonts w:ascii="Times New Roman" w:hAnsi="Times New Roman"/>
+          <w:b w:val="0"/>
+          <w:i w:val="0"/>
           <w:sz w:val="28"/>
         </w:rPr>
         <w:t>возвращает количество элементов в стеке;</w:t>
@@ -566,7 +605,10 @@
       </w:r>
       <w:r>
         <w:rPr>
+          <w:rFonts w:ascii="Times New Roman" w:hAnsi="Times New Roman" w:cs="Times New Roman"/>
           <w:rFonts w:ascii="Times New Roman" w:hAnsi="Times New Roman"/>
+          <w:b w:val="0"/>
+          <w:i w:val="0"/>
           <w:sz w:val="28"/>
         </w:rPr>
         <w:t>удаляет все элементы стека.</w:t>
@@ -574,9 +616,26 @@
     </w:p>
     <w:p>
       <w:pPr>
+        <w:spacing w:before="160" w:after="80" w:line="360" w:lineRule="auto"/>
+        <w:ind w:firstLine="0"/>
+        <w:jc w:val="left"/>
+      </w:pPr>
+      <w:r>
+        <w:rPr>
+          <w:rFonts w:ascii="Times New Roman" w:hAnsi="Times New Roman" w:cs="Times New Roman"/>
+          <w:rFonts w:ascii="Times New Roman" w:hAnsi="Times New Roman"/>
+          <w:b/>
+          <w:i w:val="0"/>
+          <w:sz w:val="28"/>
+        </w:rPr>
+        <w:t>4. Разработка модульных тестов</w:t>
+      </w:r>
+    </w:p>
+    <w:p>
+      <w:pPr>
         <w:spacing w:before="0" w:after="0" w:line="360" w:lineRule="auto"/>
         <w:ind w:firstLine="709"/>
-        <w:jc w:val="left"/>
+        <w:jc w:val="both"/>
       </w:pPr>
       <w:r>
         <w:rPr>
@@ -586,12 +645,12 @@
           <w:i w:val="0"/>
           <w:sz w:val="28"/>
         </w:rPr>
-        <w:t>Для тестирования используется стандартный модуль Python unittest. Тесты организованы в класс TestStack, наследующийся от unittest.TestCase. Метод setUp() создаёт новый экземпляр Stack перед каждым тестом, обеспечивая изоляцию. Метод tearDown() вызывает clear() после каждого теста.</w:t>
+        <w:t>Для написания тестов используется стандартный модуль Python unittest. Все тесты организованы в класс TestStack, наследующийся от unittest.TestCase. Метод setUp() создаёт новый экземпляр Stack перед каждым тестом, обеспечивая изоляцию. Метод tearDown() вызывает clear() после каждого теста, возвращая стек в начальное состояние.</w:t>
       </w:r>
     </w:p>
     <w:p>
       <w:pPr>
-        <w:spacing w:before="120" w:after="60" w:line="360" w:lineRule="auto"/>
+        <w:spacing w:before="160" w:after="80" w:line="360" w:lineRule="auto"/>
         <w:ind w:firstLine="0"/>
         <w:jc w:val="left"/>
       </w:pPr>
@@ -600,338 +659,1000 @@
           <w:rFonts w:ascii="Times New Roman" w:hAnsi="Times New Roman" w:cs="Times New Roman"/>
           <w:rFonts w:ascii="Times New Roman" w:hAnsi="Times New Roman"/>
           <w:b/>
+          <w:i w:val="0"/>
           <w:sz w:val="28"/>
         </w:rPr>
-        <w:t>Используемые методы тестирования unittest</w:t>
+        <w:t>5. Основные методы тестирования</w:t>
       </w:r>
     </w:p>
     <w:p>
       <w:pPr>
-        <w:spacing w:line="360" w:lineRule="auto"/>
-        <w:ind w:firstLine="0" w:left="709"/>
-        <w:jc w:val="left"/>
-      </w:pPr>
-      <w:r>
-        <w:rPr>
-          <w:rFonts w:ascii="Courier New" w:hAnsi="Courier New"/>
-          <w:b/>
-          <w:sz w:val="24"/>
-        </w:rPr>
-        <w:t xml:space="preserve">assertEqual(a, b) — </w:t>
-      </w:r>
-      <w:r>
-        <w:rPr>
-          <w:rFonts w:ascii="Times New Roman" w:hAnsi="Times New Roman"/>
-          <w:sz w:val="28"/>
-        </w:rPr>
-        <w:t>проверяет равенство двух значений;</w:t>
-      </w:r>
-    </w:p>
-    <w:p>
-      <w:pPr>
-        <w:spacing w:line="360" w:lineRule="auto"/>
-        <w:ind w:firstLine="0" w:left="709"/>
-        <w:jc w:val="left"/>
-      </w:pPr>
-      <w:r>
-        <w:rPr>
-          <w:rFonts w:ascii="Courier New" w:hAnsi="Courier New"/>
-          <w:b/>
-          <w:sz w:val="24"/>
-        </w:rPr>
-        <w:t xml:space="preserve">assertTrue(x) — </w:t>
-      </w:r>
-      <w:r>
-        <w:rPr>
-          <w:rFonts w:ascii="Times New Roman" w:hAnsi="Times New Roman"/>
-          <w:sz w:val="28"/>
-        </w:rPr>
-        <w:t>проверяет, что выражение истинно;</w:t>
-      </w:r>
-    </w:p>
-    <w:p>
-      <w:pPr>
-        <w:spacing w:line="360" w:lineRule="auto"/>
-        <w:ind w:firstLine="0" w:left="709"/>
-        <w:jc w:val="left"/>
-      </w:pPr>
-      <w:r>
-        <w:rPr>
-          <w:rFonts w:ascii="Courier New" w:hAnsi="Courier New"/>
-          <w:b/>
-          <w:sz w:val="24"/>
-        </w:rPr>
-        <w:t xml:space="preserve">assertFalse(x) — </w:t>
-      </w:r>
-      <w:r>
-        <w:rPr>
-          <w:rFonts w:ascii="Times New Roman" w:hAnsi="Times New Roman"/>
-          <w:sz w:val="28"/>
-        </w:rPr>
-        <w:t>проверяет, что выражение ложно;</w:t>
-      </w:r>
-    </w:p>
-    <w:p>
-      <w:pPr>
-        <w:spacing w:line="360" w:lineRule="auto"/>
-        <w:ind w:firstLine="0" w:left="709"/>
-        <w:jc w:val="left"/>
-      </w:pPr>
-      <w:r>
-        <w:rPr>
-          <w:rFonts w:ascii="Courier New" w:hAnsi="Courier New"/>
-          <w:b/>
-          <w:sz w:val="24"/>
-        </w:rPr>
-        <w:t xml:space="preserve">assertRaises(exc) — </w:t>
-      </w:r>
-      <w:r>
-        <w:rPr>
-          <w:rFonts w:ascii="Times New Roman" w:hAnsi="Times New Roman"/>
-          <w:sz w:val="28"/>
-        </w:rPr>
-        <w:t>проверяет, что вызывается ожидаемое исключение.</w:t>
-      </w:r>
-    </w:p>
-    <w:p>
-      <w:pPr>
-        <w:spacing w:before="120" w:after="60" w:line="360" w:lineRule="auto"/>
+        <w:spacing w:before="120" w:after="40"/>
         <w:ind w:firstLine="0"/>
-        <w:jc w:val="left"/>
+        <w:jc w:val="center"/>
       </w:pPr>
       <w:r>
         <w:rPr>
           <w:rFonts w:ascii="Times New Roman" w:hAnsi="Times New Roman" w:cs="Times New Roman"/>
           <w:rFonts w:ascii="Times New Roman" w:hAnsi="Times New Roman"/>
           <w:b/>
-          <w:sz w:val="28"/>
+          <w:i w:val="0"/>
+          <w:sz w:val="24"/>
         </w:rPr>
-        <w:t>Описание тестовых сценариев</w:t>
+        <w:t>Таблица 1. Методы тестирования класса Stack</w:t>
       </w:r>
     </w:p>
+    <w:tbl>
+      <w:tblPr>
+        <w:tblStyle w:val="TableGrid"/>
+        <w:tblW w:type="auto" w:w="0"/>
+        <w:tblLook w:firstColumn="1" w:firstRow="1" w:lastColumn="0" w:lastRow="0" w:noHBand="0" w:noVBand="1" w:val="04A0"/>
+      </w:tblPr>
+      <w:tblGrid>
+        <w:gridCol w:w="2422"/>
+        <w:gridCol w:w="2422"/>
+        <w:gridCol w:w="2422"/>
+        <w:gridCol w:w="2422"/>
+      </w:tblGrid>
+      <w:tr>
+        <w:tc>
+          <w:tcPr>
+            <w:tcW w:type="dxa" w:w="2422"/>
+            <w:shd w:val="clear" w:color="auto" w:fill="E0E0E0"/>
+          </w:tcPr>
+          <w:p>
+            <w:pPr>
+              <w:jc w:val="center"/>
+            </w:pPr>
+            <w:r/>
+            <w:r>
+              <w:rPr>
+                <w:rFonts w:ascii="Times New Roman" w:hAnsi="Times New Roman" w:cs="Times New Roman"/>
+                <w:rFonts w:ascii="Times New Roman" w:hAnsi="Times New Roman"/>
+                <w:b/>
+                <w:i w:val="0"/>
+                <w:sz w:val="24"/>
+              </w:rPr>
+              <w:t>№</w:t>
+            </w:r>
+          </w:p>
+        </w:tc>
+        <w:tc>
+          <w:tcPr>
+            <w:tcW w:type="dxa" w:w="2422"/>
+            <w:shd w:val="clear" w:color="auto" w:fill="E0E0E0"/>
+          </w:tcPr>
+          <w:p>
+            <w:pPr>
+              <w:jc w:val="center"/>
+            </w:pPr>
+            <w:r/>
+            <w:r>
+              <w:rPr>
+                <w:rFonts w:ascii="Times New Roman" w:hAnsi="Times New Roman" w:cs="Times New Roman"/>
+                <w:rFonts w:ascii="Times New Roman" w:hAnsi="Times New Roman"/>
+                <w:b/>
+                <w:i w:val="0"/>
+                <w:sz w:val="24"/>
+              </w:rPr>
+              <w:t>Метод теста</w:t>
+            </w:r>
+          </w:p>
+        </w:tc>
+        <w:tc>
+          <w:tcPr>
+            <w:tcW w:type="dxa" w:w="2422"/>
+            <w:shd w:val="clear" w:color="auto" w:fill="E0E0E0"/>
+          </w:tcPr>
+          <w:p>
+            <w:pPr>
+              <w:jc w:val="center"/>
+            </w:pPr>
+            <w:r/>
+            <w:r>
+              <w:rPr>
+                <w:rFonts w:ascii="Times New Roman" w:hAnsi="Times New Roman" w:cs="Times New Roman"/>
+                <w:rFonts w:ascii="Times New Roman" w:hAnsi="Times New Roman"/>
+                <w:b/>
+                <w:i w:val="0"/>
+                <w:sz w:val="24"/>
+              </w:rPr>
+              <w:t>Проверяемое свойство</w:t>
+            </w:r>
+          </w:p>
+        </w:tc>
+        <w:tc>
+          <w:tcPr>
+            <w:tcW w:type="dxa" w:w="2422"/>
+            <w:shd w:val="clear" w:color="auto" w:fill="E0E0E0"/>
+          </w:tcPr>
+          <w:p>
+            <w:pPr>
+              <w:jc w:val="center"/>
+            </w:pPr>
+            <w:r/>
+            <w:r>
+              <w:rPr>
+                <w:rFonts w:ascii="Times New Roman" w:hAnsi="Times New Roman" w:cs="Times New Roman"/>
+                <w:rFonts w:ascii="Times New Roman" w:hAnsi="Times New Roman"/>
+                <w:b/>
+                <w:i w:val="0"/>
+                <w:sz w:val="24"/>
+              </w:rPr>
+              <w:t>Assert-метод</w:t>
+            </w:r>
+          </w:p>
+        </w:tc>
+      </w:tr>
+      <w:tr>
+        <w:tc>
+          <w:tcPr>
+            <w:tcW w:type="dxa" w:w="2422"/>
+          </w:tcPr>
+          <w:p>
+            <w:pPr>
+              <w:spacing w:before="20" w:after="20"/>
+            </w:pPr>
+            <w:r/>
+            <w:r>
+              <w:rPr>
+                <w:rFonts w:ascii="Times New Roman" w:hAnsi="Times New Roman" w:cs="Times New Roman"/>
+                <w:rFonts w:ascii="Times New Roman" w:hAnsi="Times New Roman"/>
+                <w:b w:val="0"/>
+                <w:i w:val="0"/>
+                <w:sz w:val="22"/>
+              </w:rPr>
+              <w:t>1</w:t>
+            </w:r>
+          </w:p>
+        </w:tc>
+        <w:tc>
+          <w:tcPr>
+            <w:tcW w:type="dxa" w:w="2422"/>
+          </w:tcPr>
+          <w:p>
+            <w:pPr>
+              <w:spacing w:before="20" w:after="20"/>
+            </w:pPr>
+            <w:r/>
+            <w:r>
+              <w:rPr>
+                <w:rFonts w:ascii="Times New Roman" w:hAnsi="Times New Roman" w:cs="Times New Roman"/>
+                <w:rFonts w:ascii="Times New Roman" w:hAnsi="Times New Roman"/>
+                <w:b w:val="0"/>
+                <w:i w:val="0"/>
+                <w:sz w:val="22"/>
+              </w:rPr>
+              <w:t>test_push_single_element</w:t>
+            </w:r>
+          </w:p>
+        </w:tc>
+        <w:tc>
+          <w:tcPr>
+            <w:tcW w:type="dxa" w:w="2422"/>
+          </w:tcPr>
+          <w:p>
+            <w:pPr>
+              <w:spacing w:before="20" w:after="20"/>
+            </w:pPr>
+            <w:r/>
+            <w:r>
+              <w:rPr>
+                <w:rFonts w:ascii="Times New Roman" w:hAnsi="Times New Roman" w:cs="Times New Roman"/>
+                <w:rFonts w:ascii="Times New Roman" w:hAnsi="Times New Roman"/>
+                <w:b w:val="0"/>
+                <w:i w:val="0"/>
+                <w:sz w:val="22"/>
+              </w:rPr>
+              <w:t>Добавление одного элемента, стек не пустой</w:t>
+            </w:r>
+          </w:p>
+        </w:tc>
+        <w:tc>
+          <w:tcPr>
+            <w:tcW w:type="dxa" w:w="2422"/>
+          </w:tcPr>
+          <w:p>
+            <w:pPr>
+              <w:spacing w:before="20" w:after="20"/>
+            </w:pPr>
+            <w:r/>
+            <w:r>
+              <w:rPr>
+                <w:rFonts w:ascii="Times New Roman" w:hAnsi="Times New Roman" w:cs="Times New Roman"/>
+                <w:rFonts w:ascii="Times New Roman" w:hAnsi="Times New Roman"/>
+                <w:b w:val="0"/>
+                <w:i w:val="0"/>
+                <w:sz w:val="22"/>
+              </w:rPr>
+              <w:t>assertFalse, assertEqual</w:t>
+            </w:r>
+          </w:p>
+        </w:tc>
+      </w:tr>
+      <w:tr>
+        <w:tc>
+          <w:tcPr>
+            <w:tcW w:type="dxa" w:w="2422"/>
+          </w:tcPr>
+          <w:p>
+            <w:pPr>
+              <w:spacing w:before="20" w:after="20"/>
+            </w:pPr>
+            <w:r/>
+            <w:r>
+              <w:rPr>
+                <w:rFonts w:ascii="Times New Roman" w:hAnsi="Times New Roman" w:cs="Times New Roman"/>
+                <w:rFonts w:ascii="Times New Roman" w:hAnsi="Times New Roman"/>
+                <w:b w:val="0"/>
+                <w:i w:val="0"/>
+                <w:sz w:val="22"/>
+              </w:rPr>
+              <w:t>2</w:t>
+            </w:r>
+          </w:p>
+        </w:tc>
+        <w:tc>
+          <w:tcPr>
+            <w:tcW w:type="dxa" w:w="2422"/>
+          </w:tcPr>
+          <w:p>
+            <w:pPr>
+              <w:spacing w:before="20" w:after="20"/>
+            </w:pPr>
+            <w:r/>
+            <w:r>
+              <w:rPr>
+                <w:rFonts w:ascii="Times New Roman" w:hAnsi="Times New Roman" w:cs="Times New Roman"/>
+                <w:rFonts w:ascii="Times New Roman" w:hAnsi="Times New Roman"/>
+                <w:b w:val="0"/>
+                <w:i w:val="0"/>
+                <w:sz w:val="22"/>
+              </w:rPr>
+              <w:t>test_push_multiple_elements</w:t>
+            </w:r>
+          </w:p>
+        </w:tc>
+        <w:tc>
+          <w:tcPr>
+            <w:tcW w:type="dxa" w:w="2422"/>
+          </w:tcPr>
+          <w:p>
+            <w:pPr>
+              <w:spacing w:before="20" w:after="20"/>
+            </w:pPr>
+            <w:r/>
+            <w:r>
+              <w:rPr>
+                <w:rFonts w:ascii="Times New Roman" w:hAnsi="Times New Roman" w:cs="Times New Roman"/>
+                <w:rFonts w:ascii="Times New Roman" w:hAnsi="Times New Roman"/>
+                <w:b w:val="0"/>
+                <w:i w:val="0"/>
+                <w:sz w:val="22"/>
+              </w:rPr>
+              <w:t>Корректный подсчёт размера при нескольких push</w:t>
+            </w:r>
+          </w:p>
+        </w:tc>
+        <w:tc>
+          <w:tcPr>
+            <w:tcW w:type="dxa" w:w="2422"/>
+          </w:tcPr>
+          <w:p>
+            <w:pPr>
+              <w:spacing w:before="20" w:after="20"/>
+            </w:pPr>
+            <w:r/>
+            <w:r>
+              <w:rPr>
+                <w:rFonts w:ascii="Times New Roman" w:hAnsi="Times New Roman" w:cs="Times New Roman"/>
+                <w:rFonts w:ascii="Times New Roman" w:hAnsi="Times New Roman"/>
+                <w:b w:val="0"/>
+                <w:i w:val="0"/>
+                <w:sz w:val="22"/>
+              </w:rPr>
+              <w:t>assertEqual</w:t>
+            </w:r>
+          </w:p>
+        </w:tc>
+      </w:tr>
+      <w:tr>
+        <w:tc>
+          <w:tcPr>
+            <w:tcW w:type="dxa" w:w="2422"/>
+          </w:tcPr>
+          <w:p>
+            <w:pPr>
+              <w:spacing w:before="20" w:after="20"/>
+            </w:pPr>
+            <w:r/>
+            <w:r>
+              <w:rPr>
+                <w:rFonts w:ascii="Times New Roman" w:hAnsi="Times New Roman" w:cs="Times New Roman"/>
+                <w:rFonts w:ascii="Times New Roman" w:hAnsi="Times New Roman"/>
+                <w:b w:val="0"/>
+                <w:i w:val="0"/>
+                <w:sz w:val="22"/>
+              </w:rPr>
+              <w:t>3</w:t>
+            </w:r>
+          </w:p>
+        </w:tc>
+        <w:tc>
+          <w:tcPr>
+            <w:tcW w:type="dxa" w:w="2422"/>
+          </w:tcPr>
+          <w:p>
+            <w:pPr>
+              <w:spacing w:before="20" w:after="20"/>
+            </w:pPr>
+            <w:r/>
+            <w:r>
+              <w:rPr>
+                <w:rFonts w:ascii="Times New Roman" w:hAnsi="Times New Roman" w:cs="Times New Roman"/>
+                <w:rFonts w:ascii="Times New Roman" w:hAnsi="Times New Roman"/>
+                <w:b w:val="0"/>
+                <w:i w:val="0"/>
+                <w:sz w:val="22"/>
+              </w:rPr>
+              <w:t>test_pop_returns_last_pushed</w:t>
+            </w:r>
+          </w:p>
+        </w:tc>
+        <w:tc>
+          <w:tcPr>
+            <w:tcW w:type="dxa" w:w="2422"/>
+          </w:tcPr>
+          <w:p>
+            <w:pPr>
+              <w:spacing w:before="20" w:after="20"/>
+            </w:pPr>
+            <w:r/>
+            <w:r>
+              <w:rPr>
+                <w:rFonts w:ascii="Times New Roman" w:hAnsi="Times New Roman" w:cs="Times New Roman"/>
+                <w:rFonts w:ascii="Times New Roman" w:hAnsi="Times New Roman"/>
+                <w:b w:val="0"/>
+                <w:i w:val="0"/>
+                <w:sz w:val="22"/>
+              </w:rPr>
+              <w:t>Принцип LIFO: последний добавленный — первый извлечённый</w:t>
+            </w:r>
+          </w:p>
+        </w:tc>
+        <w:tc>
+          <w:tcPr>
+            <w:tcW w:type="dxa" w:w="2422"/>
+          </w:tcPr>
+          <w:p>
+            <w:pPr>
+              <w:spacing w:before="20" w:after="20"/>
+            </w:pPr>
+            <w:r/>
+            <w:r>
+              <w:rPr>
+                <w:rFonts w:ascii="Times New Roman" w:hAnsi="Times New Roman" w:cs="Times New Roman"/>
+                <w:rFonts w:ascii="Times New Roman" w:hAnsi="Times New Roman"/>
+                <w:b w:val="0"/>
+                <w:i w:val="0"/>
+                <w:sz w:val="22"/>
+              </w:rPr>
+              <w:t>assertEqual</w:t>
+            </w:r>
+          </w:p>
+        </w:tc>
+      </w:tr>
+      <w:tr>
+        <w:tc>
+          <w:tcPr>
+            <w:tcW w:type="dxa" w:w="2422"/>
+          </w:tcPr>
+          <w:p>
+            <w:pPr>
+              <w:spacing w:before="20" w:after="20"/>
+            </w:pPr>
+            <w:r/>
+            <w:r>
+              <w:rPr>
+                <w:rFonts w:ascii="Times New Roman" w:hAnsi="Times New Roman" w:cs="Times New Roman"/>
+                <w:rFonts w:ascii="Times New Roman" w:hAnsi="Times New Roman"/>
+                <w:b w:val="0"/>
+                <w:i w:val="0"/>
+                <w:sz w:val="22"/>
+              </w:rPr>
+              <w:t>4</w:t>
+            </w:r>
+          </w:p>
+        </w:tc>
+        <w:tc>
+          <w:tcPr>
+            <w:tcW w:type="dxa" w:w="2422"/>
+          </w:tcPr>
+          <w:p>
+            <w:pPr>
+              <w:spacing w:before="20" w:after="20"/>
+            </w:pPr>
+            <w:r/>
+            <w:r>
+              <w:rPr>
+                <w:rFonts w:ascii="Times New Roman" w:hAnsi="Times New Roman" w:cs="Times New Roman"/>
+                <w:rFonts w:ascii="Times New Roman" w:hAnsi="Times New Roman"/>
+                <w:b w:val="0"/>
+                <w:i w:val="0"/>
+                <w:sz w:val="22"/>
+              </w:rPr>
+              <w:t>test_pop_empty_stack_raises_index_error</w:t>
+            </w:r>
+          </w:p>
+        </w:tc>
+        <w:tc>
+          <w:tcPr>
+            <w:tcW w:type="dxa" w:w="2422"/>
+          </w:tcPr>
+          <w:p>
+            <w:pPr>
+              <w:spacing w:before="20" w:after="20"/>
+            </w:pPr>
+            <w:r/>
+            <w:r>
+              <w:rPr>
+                <w:rFonts w:ascii="Times New Roman" w:hAnsi="Times New Roman" w:cs="Times New Roman"/>
+                <w:rFonts w:ascii="Times New Roman" w:hAnsi="Times New Roman"/>
+                <w:b w:val="0"/>
+                <w:i w:val="0"/>
+                <w:sz w:val="22"/>
+              </w:rPr>
+              <w:t>Pop на пустом стеке вызывает IndexError</w:t>
+            </w:r>
+          </w:p>
+        </w:tc>
+        <w:tc>
+          <w:tcPr>
+            <w:tcW w:type="dxa" w:w="2422"/>
+          </w:tcPr>
+          <w:p>
+            <w:pPr>
+              <w:spacing w:before="20" w:after="20"/>
+            </w:pPr>
+            <w:r/>
+            <w:r>
+              <w:rPr>
+                <w:rFonts w:ascii="Times New Roman" w:hAnsi="Times New Roman" w:cs="Times New Roman"/>
+                <w:rFonts w:ascii="Times New Roman" w:hAnsi="Times New Roman"/>
+                <w:b w:val="0"/>
+                <w:i w:val="0"/>
+                <w:sz w:val="22"/>
+              </w:rPr>
+              <w:t>assertRaises</w:t>
+            </w:r>
+          </w:p>
+        </w:tc>
+      </w:tr>
+      <w:tr>
+        <w:tc>
+          <w:tcPr>
+            <w:tcW w:type="dxa" w:w="2422"/>
+          </w:tcPr>
+          <w:p>
+            <w:pPr>
+              <w:spacing w:before="20" w:after="20"/>
+            </w:pPr>
+            <w:r/>
+            <w:r>
+              <w:rPr>
+                <w:rFonts w:ascii="Times New Roman" w:hAnsi="Times New Roman" w:cs="Times New Roman"/>
+                <w:rFonts w:ascii="Times New Roman" w:hAnsi="Times New Roman"/>
+                <w:b w:val="0"/>
+                <w:i w:val="0"/>
+                <w:sz w:val="22"/>
+              </w:rPr>
+              <w:t>5</w:t>
+            </w:r>
+          </w:p>
+        </w:tc>
+        <w:tc>
+          <w:tcPr>
+            <w:tcW w:type="dxa" w:w="2422"/>
+          </w:tcPr>
+          <w:p>
+            <w:pPr>
+              <w:spacing w:before="20" w:after="20"/>
+            </w:pPr>
+            <w:r/>
+            <w:r>
+              <w:rPr>
+                <w:rFonts w:ascii="Times New Roman" w:hAnsi="Times New Roman" w:cs="Times New Roman"/>
+                <w:rFonts w:ascii="Times New Roman" w:hAnsi="Times New Roman"/>
+                <w:b w:val="0"/>
+                <w:i w:val="0"/>
+                <w:sz w:val="22"/>
+              </w:rPr>
+              <w:t>test_peek_returns_top_without_removing</w:t>
+            </w:r>
+          </w:p>
+        </w:tc>
+        <w:tc>
+          <w:tcPr>
+            <w:tcW w:type="dxa" w:w="2422"/>
+          </w:tcPr>
+          <w:p>
+            <w:pPr>
+              <w:spacing w:before="20" w:after="20"/>
+            </w:pPr>
+            <w:r/>
+            <w:r>
+              <w:rPr>
+                <w:rFonts w:ascii="Times New Roman" w:hAnsi="Times New Roman" w:cs="Times New Roman"/>
+                <w:rFonts w:ascii="Times New Roman" w:hAnsi="Times New Roman"/>
+                <w:b w:val="0"/>
+                <w:i w:val="0"/>
+                <w:sz w:val="22"/>
+              </w:rPr>
+              <w:t>peek возвращает вершину без удаления</w:t>
+            </w:r>
+          </w:p>
+        </w:tc>
+        <w:tc>
+          <w:tcPr>
+            <w:tcW w:type="dxa" w:w="2422"/>
+          </w:tcPr>
+          <w:p>
+            <w:pPr>
+              <w:spacing w:before="20" w:after="20"/>
+            </w:pPr>
+            <w:r/>
+            <w:r>
+              <w:rPr>
+                <w:rFonts w:ascii="Times New Roman" w:hAnsi="Times New Roman" w:cs="Times New Roman"/>
+                <w:rFonts w:ascii="Times New Roman" w:hAnsi="Times New Roman"/>
+                <w:b w:val="0"/>
+                <w:i w:val="0"/>
+                <w:sz w:val="22"/>
+              </w:rPr>
+              <w:t>assertEqual</w:t>
+            </w:r>
+          </w:p>
+        </w:tc>
+      </w:tr>
+      <w:tr>
+        <w:tc>
+          <w:tcPr>
+            <w:tcW w:type="dxa" w:w="2422"/>
+          </w:tcPr>
+          <w:p>
+            <w:pPr>
+              <w:spacing w:before="20" w:after="20"/>
+            </w:pPr>
+            <w:r/>
+            <w:r>
+              <w:rPr>
+                <w:rFonts w:ascii="Times New Roman" w:hAnsi="Times New Roman" w:cs="Times New Roman"/>
+                <w:rFonts w:ascii="Times New Roman" w:hAnsi="Times New Roman"/>
+                <w:b w:val="0"/>
+                <w:i w:val="0"/>
+                <w:sz w:val="22"/>
+              </w:rPr>
+              <w:t>6</w:t>
+            </w:r>
+          </w:p>
+        </w:tc>
+        <w:tc>
+          <w:tcPr>
+            <w:tcW w:type="dxa" w:w="2422"/>
+          </w:tcPr>
+          <w:p>
+            <w:pPr>
+              <w:spacing w:before="20" w:after="20"/>
+            </w:pPr>
+            <w:r/>
+            <w:r>
+              <w:rPr>
+                <w:rFonts w:ascii="Times New Roman" w:hAnsi="Times New Roman" w:cs="Times New Roman"/>
+                <w:rFonts w:ascii="Times New Roman" w:hAnsi="Times New Roman"/>
+                <w:b w:val="0"/>
+                <w:i w:val="0"/>
+                <w:sz w:val="22"/>
+              </w:rPr>
+              <w:t>test_peek_empty_stack_raises_index_error</w:t>
+            </w:r>
+          </w:p>
+        </w:tc>
+        <w:tc>
+          <w:tcPr>
+            <w:tcW w:type="dxa" w:w="2422"/>
+          </w:tcPr>
+          <w:p>
+            <w:pPr>
+              <w:spacing w:before="20" w:after="20"/>
+            </w:pPr>
+            <w:r/>
+            <w:r>
+              <w:rPr>
+                <w:rFonts w:ascii="Times New Roman" w:hAnsi="Times New Roman" w:cs="Times New Roman"/>
+                <w:rFonts w:ascii="Times New Roman" w:hAnsi="Times New Roman"/>
+                <w:b w:val="0"/>
+                <w:i w:val="0"/>
+                <w:sz w:val="22"/>
+              </w:rPr>
+              <w:t>peek на пустом стеке вызывает IndexError</w:t>
+            </w:r>
+          </w:p>
+        </w:tc>
+        <w:tc>
+          <w:tcPr>
+            <w:tcW w:type="dxa" w:w="2422"/>
+          </w:tcPr>
+          <w:p>
+            <w:pPr>
+              <w:spacing w:before="20" w:after="20"/>
+            </w:pPr>
+            <w:r/>
+            <w:r>
+              <w:rPr>
+                <w:rFonts w:ascii="Times New Roman" w:hAnsi="Times New Roman" w:cs="Times New Roman"/>
+                <w:rFonts w:ascii="Times New Roman" w:hAnsi="Times New Roman"/>
+                <w:b w:val="0"/>
+                <w:i w:val="0"/>
+                <w:sz w:val="22"/>
+              </w:rPr>
+              <w:t>assertRaises</w:t>
+            </w:r>
+          </w:p>
+        </w:tc>
+      </w:tr>
+      <w:tr>
+        <w:tc>
+          <w:tcPr>
+            <w:tcW w:type="dxa" w:w="2422"/>
+          </w:tcPr>
+          <w:p>
+            <w:pPr>
+              <w:spacing w:before="20" w:after="20"/>
+            </w:pPr>
+            <w:r/>
+            <w:r>
+              <w:rPr>
+                <w:rFonts w:ascii="Times New Roman" w:hAnsi="Times New Roman" w:cs="Times New Roman"/>
+                <w:rFonts w:ascii="Times New Roman" w:hAnsi="Times New Roman"/>
+                <w:b w:val="0"/>
+                <w:i w:val="0"/>
+                <w:sz w:val="22"/>
+              </w:rPr>
+              <w:t>7</w:t>
+            </w:r>
+          </w:p>
+        </w:tc>
+        <w:tc>
+          <w:tcPr>
+            <w:tcW w:type="dxa" w:w="2422"/>
+          </w:tcPr>
+          <w:p>
+            <w:pPr>
+              <w:spacing w:before="20" w:after="20"/>
+            </w:pPr>
+            <w:r/>
+            <w:r>
+              <w:rPr>
+                <w:rFonts w:ascii="Times New Roman" w:hAnsi="Times New Roman" w:cs="Times New Roman"/>
+                <w:rFonts w:ascii="Times New Roman" w:hAnsi="Times New Roman"/>
+                <w:b w:val="0"/>
+                <w:i w:val="0"/>
+                <w:sz w:val="22"/>
+              </w:rPr>
+              <w:t>test_is_empty_on_new_stack</w:t>
+            </w:r>
+          </w:p>
+        </w:tc>
+        <w:tc>
+          <w:tcPr>
+            <w:tcW w:type="dxa" w:w="2422"/>
+          </w:tcPr>
+          <w:p>
+            <w:pPr>
+              <w:spacing w:before="20" w:after="20"/>
+            </w:pPr>
+            <w:r/>
+            <w:r>
+              <w:rPr>
+                <w:rFonts w:ascii="Times New Roman" w:hAnsi="Times New Roman" w:cs="Times New Roman"/>
+                <w:rFonts w:ascii="Times New Roman" w:hAnsi="Times New Roman"/>
+                <w:b w:val="0"/>
+                <w:i w:val="0"/>
+                <w:sz w:val="22"/>
+              </w:rPr>
+              <w:t>Новый стек пустой</w:t>
+            </w:r>
+          </w:p>
+        </w:tc>
+        <w:tc>
+          <w:tcPr>
+            <w:tcW w:type="dxa" w:w="2422"/>
+          </w:tcPr>
+          <w:p>
+            <w:pPr>
+              <w:spacing w:before="20" w:after="20"/>
+            </w:pPr>
+            <w:r/>
+            <w:r>
+              <w:rPr>
+                <w:rFonts w:ascii="Times New Roman" w:hAnsi="Times New Roman" w:cs="Times New Roman"/>
+                <w:rFonts w:ascii="Times New Roman" w:hAnsi="Times New Roman"/>
+                <w:b w:val="0"/>
+                <w:i w:val="0"/>
+                <w:sz w:val="22"/>
+              </w:rPr>
+              <w:t>assertTrue</w:t>
+            </w:r>
+          </w:p>
+        </w:tc>
+      </w:tr>
+      <w:tr>
+        <w:tc>
+          <w:tcPr>
+            <w:tcW w:type="dxa" w:w="2422"/>
+          </w:tcPr>
+          <w:p>
+            <w:pPr>
+              <w:spacing w:before="20" w:after="20"/>
+            </w:pPr>
+            <w:r/>
+            <w:r>
+              <w:rPr>
+                <w:rFonts w:ascii="Times New Roman" w:hAnsi="Times New Roman" w:cs="Times New Roman"/>
+                <w:rFonts w:ascii="Times New Roman" w:hAnsi="Times New Roman"/>
+                <w:b w:val="0"/>
+                <w:i w:val="0"/>
+                <w:sz w:val="22"/>
+              </w:rPr>
+              <w:t>8</w:t>
+            </w:r>
+          </w:p>
+        </w:tc>
+        <w:tc>
+          <w:tcPr>
+            <w:tcW w:type="dxa" w:w="2422"/>
+          </w:tcPr>
+          <w:p>
+            <w:pPr>
+              <w:spacing w:before="20" w:after="20"/>
+            </w:pPr>
+            <w:r/>
+            <w:r>
+              <w:rPr>
+                <w:rFonts w:ascii="Times New Roman" w:hAnsi="Times New Roman" w:cs="Times New Roman"/>
+                <w:rFonts w:ascii="Times New Roman" w:hAnsi="Times New Roman"/>
+                <w:b w:val="0"/>
+                <w:i w:val="0"/>
+                <w:sz w:val="22"/>
+              </w:rPr>
+              <w:t>test_is_empty_after_push_and_pop</w:t>
+            </w:r>
+          </w:p>
+        </w:tc>
+        <w:tc>
+          <w:tcPr>
+            <w:tcW w:type="dxa" w:w="2422"/>
+          </w:tcPr>
+          <w:p>
+            <w:pPr>
+              <w:spacing w:before="20" w:after="20"/>
+            </w:pPr>
+            <w:r/>
+            <w:r>
+              <w:rPr>
+                <w:rFonts w:ascii="Times New Roman" w:hAnsi="Times New Roman" w:cs="Times New Roman"/>
+                <w:rFonts w:ascii="Times New Roman" w:hAnsi="Times New Roman"/>
+                <w:b w:val="0"/>
+                <w:i w:val="0"/>
+                <w:sz w:val="22"/>
+              </w:rPr>
+              <w:t>Стек пустой после удаления всех элементов</w:t>
+            </w:r>
+          </w:p>
+        </w:tc>
+        <w:tc>
+          <w:tcPr>
+            <w:tcW w:type="dxa" w:w="2422"/>
+          </w:tcPr>
+          <w:p>
+            <w:pPr>
+              <w:spacing w:before="20" w:after="20"/>
+            </w:pPr>
+            <w:r/>
+            <w:r>
+              <w:rPr>
+                <w:rFonts w:ascii="Times New Roman" w:hAnsi="Times New Roman" w:cs="Times New Roman"/>
+                <w:rFonts w:ascii="Times New Roman" w:hAnsi="Times New Roman"/>
+                <w:b w:val="0"/>
+                <w:i w:val="0"/>
+                <w:sz w:val="22"/>
+              </w:rPr>
+              <w:t>assertTrue</w:t>
+            </w:r>
+          </w:p>
+        </w:tc>
+      </w:tr>
+      <w:tr>
+        <w:tc>
+          <w:tcPr>
+            <w:tcW w:type="dxa" w:w="2422"/>
+          </w:tcPr>
+          <w:p>
+            <w:pPr>
+              <w:spacing w:before="20" w:after="20"/>
+            </w:pPr>
+            <w:r/>
+            <w:r>
+              <w:rPr>
+                <w:rFonts w:ascii="Times New Roman" w:hAnsi="Times New Roman" w:cs="Times New Roman"/>
+                <w:rFonts w:ascii="Times New Roman" w:hAnsi="Times New Roman"/>
+                <w:b w:val="0"/>
+                <w:i w:val="0"/>
+                <w:sz w:val="22"/>
+              </w:rPr>
+              <w:t>9</w:t>
+            </w:r>
+          </w:p>
+        </w:tc>
+        <w:tc>
+          <w:tcPr>
+            <w:tcW w:type="dxa" w:w="2422"/>
+          </w:tcPr>
+          <w:p>
+            <w:pPr>
+              <w:spacing w:before="20" w:after="20"/>
+            </w:pPr>
+            <w:r/>
+            <w:r>
+              <w:rPr>
+                <w:rFonts w:ascii="Times New Roman" w:hAnsi="Times New Roman" w:cs="Times New Roman"/>
+                <w:rFonts w:ascii="Times New Roman" w:hAnsi="Times New Roman"/>
+                <w:b w:val="0"/>
+                <w:i w:val="0"/>
+                <w:sz w:val="22"/>
+              </w:rPr>
+              <w:t>test_clear_empties_the_stack</w:t>
+            </w:r>
+          </w:p>
+        </w:tc>
+        <w:tc>
+          <w:tcPr>
+            <w:tcW w:type="dxa" w:w="2422"/>
+          </w:tcPr>
+          <w:p>
+            <w:pPr>
+              <w:spacing w:before="20" w:after="20"/>
+            </w:pPr>
+            <w:r/>
+            <w:r>
+              <w:rPr>
+                <w:rFonts w:ascii="Times New Roman" w:hAnsi="Times New Roman" w:cs="Times New Roman"/>
+                <w:rFonts w:ascii="Times New Roman" w:hAnsi="Times New Roman"/>
+                <w:b w:val="0"/>
+                <w:i w:val="0"/>
+                <w:sz w:val="22"/>
+              </w:rPr>
+              <w:t>clear полностью опустошает стек</w:t>
+            </w:r>
+          </w:p>
+        </w:tc>
+        <w:tc>
+          <w:tcPr>
+            <w:tcW w:type="dxa" w:w="2422"/>
+          </w:tcPr>
+          <w:p>
+            <w:pPr>
+              <w:spacing w:before="20" w:after="20"/>
+            </w:pPr>
+            <w:r/>
+            <w:r>
+              <w:rPr>
+                <w:rFonts w:ascii="Times New Roman" w:hAnsi="Times New Roman" w:cs="Times New Roman"/>
+                <w:rFonts w:ascii="Times New Roman" w:hAnsi="Times New Roman"/>
+                <w:b w:val="0"/>
+                <w:i w:val="0"/>
+                <w:sz w:val="22"/>
+              </w:rPr>
+              <w:t>assertTrue, assertEqual</w:t>
+            </w:r>
+          </w:p>
+        </w:tc>
+      </w:tr>
+      <w:tr>
+        <w:tc>
+          <w:tcPr>
+            <w:tcW w:type="dxa" w:w="2422"/>
+          </w:tcPr>
+          <w:p>
+            <w:pPr>
+              <w:spacing w:before="20" w:after="20"/>
+            </w:pPr>
+            <w:r/>
+            <w:r>
+              <w:rPr>
+                <w:rFonts w:ascii="Times New Roman" w:hAnsi="Times New Roman" w:cs="Times New Roman"/>
+                <w:rFonts w:ascii="Times New Roman" w:hAnsi="Times New Roman"/>
+                <w:b w:val="0"/>
+                <w:i w:val="0"/>
+                <w:sz w:val="22"/>
+              </w:rPr>
+              <w:t>10</w:t>
+            </w:r>
+          </w:p>
+        </w:tc>
+        <w:tc>
+          <w:tcPr>
+            <w:tcW w:type="dxa" w:w="2422"/>
+          </w:tcPr>
+          <w:p>
+            <w:pPr>
+              <w:spacing w:before="20" w:after="20"/>
+            </w:pPr>
+            <w:r/>
+            <w:r>
+              <w:rPr>
+                <w:rFonts w:ascii="Times New Roman" w:hAnsi="Times New Roman" w:cs="Times New Roman"/>
+                <w:rFonts w:ascii="Times New Roman" w:hAnsi="Times New Roman"/>
+                <w:b w:val="0"/>
+                <w:i w:val="0"/>
+                <w:sz w:val="22"/>
+              </w:rPr>
+              <w:t>test_push_mixed_types</w:t>
+            </w:r>
+          </w:p>
+        </w:tc>
+        <w:tc>
+          <w:tcPr>
+            <w:tcW w:type="dxa" w:w="2422"/>
+          </w:tcPr>
+          <w:p>
+            <w:pPr>
+              <w:spacing w:before="20" w:after="20"/>
+            </w:pPr>
+            <w:r/>
+            <w:r>
+              <w:rPr>
+                <w:rFonts w:ascii="Times New Roman" w:hAnsi="Times New Roman" w:cs="Times New Roman"/>
+                <w:rFonts w:ascii="Times New Roman" w:hAnsi="Times New Roman"/>
+                <w:b w:val="0"/>
+                <w:i w:val="0"/>
+                <w:sz w:val="22"/>
+              </w:rPr>
+              <w:t>Стек хранит элементы разных типов</w:t>
+            </w:r>
+          </w:p>
+        </w:tc>
+        <w:tc>
+          <w:tcPr>
+            <w:tcW w:type="dxa" w:w="2422"/>
+          </w:tcPr>
+          <w:p>
+            <w:pPr>
+              <w:spacing w:before="20" w:after="20"/>
+            </w:pPr>
+            <w:r/>
+            <w:r>
+              <w:rPr>
+                <w:rFonts w:ascii="Times New Roman" w:hAnsi="Times New Roman" w:cs="Times New Roman"/>
+                <w:rFonts w:ascii="Times New Roman" w:hAnsi="Times New Roman"/>
+                <w:b w:val="0"/>
+                <w:i w:val="0"/>
+                <w:sz w:val="22"/>
+              </w:rPr>
+              <w:t>assertEqual, assertAlmostEqual</w:t>
+            </w:r>
+          </w:p>
+        </w:tc>
+      </w:tr>
+    </w:tbl>
     <w:p>
       <w:pPr>
-        <w:spacing w:line="360" w:lineRule="auto"/>
-        <w:ind w:firstLine="709"/>
-        <w:jc w:val="left"/>
-      </w:pPr>
-      <w:r>
-        <w:rPr>
-          <w:rFonts w:ascii="Times New Roman" w:hAnsi="Times New Roman"/>
-          <w:b/>
-          <w:sz w:val="28"/>
-        </w:rPr>
-        <w:t xml:space="preserve">Тест 1 — test_push_single_element: </w:t>
-      </w:r>
-      <w:r>
-        <w:rPr>
-          <w:rFonts w:ascii="Times New Roman" w:hAnsi="Times New Roman"/>
-          <w:sz w:val="28"/>
-        </w:rPr>
-        <w:t>Проверяет, что после вызова push() стек не является пустым и его размер равен 1. Используемые assert: assertFalse(is_empty()), assertEqual(size(), 1).</w:t>
-      </w:r>
+        <w:spacing w:before="0" w:after="120"/>
+      </w:pPr>
     </w:p>
     <w:p>
       <w:pPr>
-        <w:spacing w:line="360" w:lineRule="auto"/>
-        <w:ind w:firstLine="709"/>
-        <w:jc w:val="left"/>
-      </w:pPr>
-      <w:r>
-        <w:rPr>
-          <w:rFonts w:ascii="Times New Roman" w:hAnsi="Times New Roman"/>
-          <w:b/>
-          <w:sz w:val="28"/>
-        </w:rPr>
-        <w:t xml:space="preserve">Тест 2 — test_push_multiple_elements: </w:t>
-      </w:r>
-      <w:r>
-        <w:rPr>
-          <w:rFonts w:ascii="Times New Roman" w:hAnsi="Times New Roman"/>
-          <w:sz w:val="28"/>
-        </w:rPr>
-        <w:t>Последовательно добавляет 4 элемента и проверяет, что размер стека равен 4. Используемый assert: assertEqual(size(), 4).</w:t>
-      </w:r>
-    </w:p>
-    <w:p>
-      <w:pPr>
-        <w:spacing w:line="360" w:lineRule="auto"/>
-        <w:ind w:firstLine="709"/>
-        <w:jc w:val="left"/>
-      </w:pPr>
-      <w:r>
-        <w:rPr>
-          <w:rFonts w:ascii="Times New Roman" w:hAnsi="Times New Roman"/>
-          <w:b/>
-          <w:sz w:val="28"/>
-        </w:rPr>
-        <w:t xml:space="preserve">Тест 3 — test_pop_returns_last_pushed: </w:t>
-      </w:r>
-      <w:r>
-        <w:rPr>
-          <w:rFonts w:ascii="Times New Roman" w:hAnsi="Times New Roman"/>
-          <w:sz w:val="28"/>
-        </w:rPr>
-        <w:t>Добавляет три строки и извлекает их в обратном порядке (LIFO). Проверяет, что каждый pop() возвращает элемент в правильном порядке. Используемый assert: assertEqual(pop(), ожидаемое).</w:t>
-      </w:r>
-    </w:p>
-    <w:p>
-      <w:pPr>
-        <w:spacing w:line="360" w:lineRule="auto"/>
-        <w:ind w:firstLine="709"/>
-        <w:jc w:val="left"/>
-      </w:pPr>
-      <w:r>
-        <w:rPr>
-          <w:rFonts w:ascii="Times New Roman" w:hAnsi="Times New Roman"/>
-          <w:b/>
-          <w:sz w:val="28"/>
-        </w:rPr>
-        <w:t xml:space="preserve">Тест 4 — test_pop_empty_stack_raises_index_error: </w:t>
-      </w:r>
-      <w:r>
-        <w:rPr>
-          <w:rFonts w:ascii="Times New Roman" w:hAnsi="Times New Roman"/>
-          <w:sz w:val="28"/>
-        </w:rPr>
-        <w:t>Вызывает pop() на пустом стеке и ожидает исключение IndexError. Используемый assert: assertRaises(IndexError).</w:t>
-      </w:r>
-    </w:p>
-    <w:p>
-      <w:pPr>
-        <w:spacing w:line="360" w:lineRule="auto"/>
-        <w:ind w:firstLine="709"/>
-        <w:jc w:val="left"/>
-      </w:pPr>
-      <w:r>
-        <w:rPr>
-          <w:rFonts w:ascii="Times New Roman" w:hAnsi="Times New Roman"/>
-          <w:b/>
-          <w:sz w:val="28"/>
-        </w:rPr>
-        <w:t xml:space="preserve">Тест 5 — test_peek_returns_top_without_removing: </w:t>
-      </w:r>
-      <w:r>
-        <w:rPr>
-          <w:rFonts w:ascii="Times New Roman" w:hAnsi="Times New Roman"/>
-          <w:sz w:val="28"/>
-        </w:rPr>
-        <w:t>Добавляет два элемента, вызывает peek() и проверяет, что возвращается вершина без уменьшения размера стека. Используемые assert: assertEqual(peek(), 200), assertEqual(size(), 2).</w:t>
-      </w:r>
-    </w:p>
-    <w:p>
-      <w:pPr>
-        <w:spacing w:line="360" w:lineRule="auto"/>
-        <w:ind w:firstLine="709"/>
-        <w:jc w:val="left"/>
-      </w:pPr>
-      <w:r>
-        <w:rPr>
-          <w:rFonts w:ascii="Times New Roman" w:hAnsi="Times New Roman"/>
-          <w:b/>
-          <w:sz w:val="28"/>
-        </w:rPr>
-        <w:t xml:space="preserve">Тест 6 — test_peek_empty_stack_raises_index_error: </w:t>
-      </w:r>
-      <w:r>
-        <w:rPr>
-          <w:rFonts w:ascii="Times New Roman" w:hAnsi="Times New Roman"/>
-          <w:sz w:val="28"/>
-        </w:rPr>
-        <w:t>Вызывает peek() на пустом стеке и ожидает исключение IndexError. Используемый assert: assertRaises(IndexError).</w:t>
-      </w:r>
-    </w:p>
-    <w:p>
-      <w:pPr>
-        <w:spacing w:line="360" w:lineRule="auto"/>
-        <w:ind w:firstLine="709"/>
-        <w:jc w:val="left"/>
-      </w:pPr>
-      <w:r>
-        <w:rPr>
-          <w:rFonts w:ascii="Times New Roman" w:hAnsi="Times New Roman"/>
-          <w:b/>
-          <w:sz w:val="28"/>
-        </w:rPr>
-        <w:t xml:space="preserve">Тест 7 — test_is_empty_on_new_stack: </w:t>
-      </w:r>
-      <w:r>
-        <w:rPr>
-          <w:rFonts w:ascii="Times New Roman" w:hAnsi="Times New Roman"/>
-          <w:sz w:val="28"/>
-        </w:rPr>
-        <w:t>Проверяет, что только что созданный стек пуст. Используемый assert: assertTrue(is_empty()).</w:t>
-      </w:r>
-    </w:p>
-    <w:p>
-      <w:pPr>
-        <w:spacing w:line="360" w:lineRule="auto"/>
-        <w:ind w:firstLine="709"/>
-        <w:jc w:val="left"/>
-      </w:pPr>
-      <w:r>
-        <w:rPr>
-          <w:rFonts w:ascii="Times New Roman" w:hAnsi="Times New Roman"/>
-          <w:b/>
-          <w:sz w:val="28"/>
-        </w:rPr>
-        <w:t xml:space="preserve">Тест 8 — test_is_empty_after_push_and_pop: </w:t>
-      </w:r>
-      <w:r>
-        <w:rPr>
-          <w:rFonts w:ascii="Times New Roman" w:hAnsi="Times New Roman"/>
-          <w:sz w:val="28"/>
-        </w:rPr>
-        <w:t>Добавляет два элемента, затем удаляет их и проверяет, что стек снова стал пустым. Используемый assert: assertTrue(is_empty()).</w:t>
-      </w:r>
-    </w:p>
-    <w:p>
-      <w:pPr>
-        <w:spacing w:line="360" w:lineRule="auto"/>
-        <w:ind w:firstLine="709"/>
-        <w:jc w:val="left"/>
-      </w:pPr>
-      <w:r>
-        <w:rPr>
-          <w:rFonts w:ascii="Times New Roman" w:hAnsi="Times New Roman"/>
-          <w:b/>
-          <w:sz w:val="28"/>
-        </w:rPr>
-        <w:t xml:space="preserve">Тест 9 — test_clear_empties_the_stack: </w:t>
-      </w:r>
-      <w:r>
-        <w:rPr>
-          <w:rFonts w:ascii="Times New Roman" w:hAnsi="Times New Roman"/>
-          <w:sz w:val="28"/>
-        </w:rPr>
-        <w:t>Добавляет 5 элементов, вызывает clear() и проверяет, что стек пустой и размер равен 0. Используемые assert: assertTrue(is_empty()), assertEqual(size(), 0).</w:t>
-      </w:r>
-    </w:p>
-    <w:p>
-      <w:pPr>
-        <w:spacing w:line="360" w:lineRule="auto"/>
-        <w:ind w:firstLine="709"/>
-        <w:jc w:val="left"/>
-      </w:pPr>
-      <w:r>
-        <w:rPr>
-          <w:rFonts w:ascii="Times New Roman" w:hAnsi="Times New Roman"/>
-          <w:b/>
-          <w:sz w:val="28"/>
-        </w:rPr>
-        <w:t xml:space="preserve">Тест 10 — test_push_mixed_types: </w:t>
-      </w:r>
-      <w:r>
-        <w:rPr>
-          <w:rFonts w:ascii="Times New Roman" w:hAnsi="Times New Roman"/>
-          <w:sz w:val="28"/>
-        </w:rPr>
-        <w:t>Добавляет элементы разных типов (int, str, float, list) и проверяет, что размер и порядок извлечения корректны. Используемые assert: assertEqual(size(), 4), assertEqual(pop(), ...).</w:t>
-      </w:r>
-    </w:p>
-    <w:p>
-      <w:pPr>
-        <w:spacing w:before="120" w:after="60" w:line="360" w:lineRule="auto"/>
+        <w:spacing w:before="160" w:after="80" w:line="360" w:lineRule="auto"/>
         <w:ind w:firstLine="0"/>
         <w:jc w:val="left"/>
       </w:pPr>
@@ -940,16 +1661,461 @@
           <w:rFonts w:ascii="Times New Roman" w:hAnsi="Times New Roman" w:cs="Times New Roman"/>
           <w:rFonts w:ascii="Times New Roman" w:hAnsi="Times New Roman"/>
           <w:b/>
+          <w:i w:val="0"/>
           <w:sz w:val="28"/>
         </w:rPr>
-        <w:t>Код программы</w:t>
+        <w:t>6. Описание assert-методов</w:t>
       </w:r>
     </w:p>
     <w:p>
       <w:pPr>
+        <w:spacing w:before="120" w:after="40"/>
+        <w:ind w:firstLine="0"/>
+        <w:jc w:val="center"/>
+      </w:pPr>
+      <w:r>
+        <w:rPr>
+          <w:rFonts w:ascii="Times New Roman" w:hAnsi="Times New Roman" w:cs="Times New Roman"/>
+          <w:rFonts w:ascii="Times New Roman" w:hAnsi="Times New Roman"/>
+          <w:b/>
+          <w:i w:val="0"/>
+          <w:sz w:val="24"/>
+        </w:rPr>
+        <w:t>Таблица 2. Assert-методы unittest</w:t>
+      </w:r>
+    </w:p>
+    <w:tbl>
+      <w:tblPr>
+        <w:tblStyle w:val="TableGrid"/>
+        <w:tblW w:type="auto" w:w="0"/>
+        <w:tblLook w:firstColumn="1" w:firstRow="1" w:lastColumn="0" w:lastRow="0" w:noHBand="0" w:noVBand="1" w:val="04A0"/>
+      </w:tblPr>
+      <w:tblGrid>
+        <w:gridCol w:w="3230"/>
+        <w:gridCol w:w="3230"/>
+        <w:gridCol w:w="3230"/>
+      </w:tblGrid>
+      <w:tr>
+        <w:tc>
+          <w:tcPr>
+            <w:tcW w:type="dxa" w:w="3230"/>
+            <w:shd w:val="clear" w:color="auto" w:fill="E0E0E0"/>
+          </w:tcPr>
+          <w:p>
+            <w:pPr>
+              <w:jc w:val="center"/>
+            </w:pPr>
+            <w:r/>
+            <w:r>
+              <w:rPr>
+                <w:rFonts w:ascii="Times New Roman" w:hAnsi="Times New Roman" w:cs="Times New Roman"/>
+                <w:rFonts w:ascii="Times New Roman" w:hAnsi="Times New Roman"/>
+                <w:b/>
+                <w:i w:val="0"/>
+                <w:sz w:val="24"/>
+              </w:rPr>
+              <w:t>Метод</w:t>
+            </w:r>
+          </w:p>
+        </w:tc>
+        <w:tc>
+          <w:tcPr>
+            <w:tcW w:type="dxa" w:w="3230"/>
+            <w:shd w:val="clear" w:color="auto" w:fill="E0E0E0"/>
+          </w:tcPr>
+          <w:p>
+            <w:pPr>
+              <w:jc w:val="center"/>
+            </w:pPr>
+            <w:r/>
+            <w:r>
+              <w:rPr>
+                <w:rFonts w:ascii="Times New Roman" w:hAnsi="Times New Roman" w:cs="Times New Roman"/>
+                <w:rFonts w:ascii="Times New Roman" w:hAnsi="Times New Roman"/>
+                <w:b/>
+                <w:i w:val="0"/>
+                <w:sz w:val="24"/>
+              </w:rPr>
+              <w:t>Назначение</w:t>
+            </w:r>
+          </w:p>
+        </w:tc>
+        <w:tc>
+          <w:tcPr>
+            <w:tcW w:type="dxa" w:w="3230"/>
+            <w:shd w:val="clear" w:color="auto" w:fill="E0E0E0"/>
+          </w:tcPr>
+          <w:p>
+            <w:pPr>
+              <w:jc w:val="center"/>
+            </w:pPr>
+            <w:r/>
+            <w:r>
+              <w:rPr>
+                <w:rFonts w:ascii="Times New Roman" w:hAnsi="Times New Roman" w:cs="Times New Roman"/>
+                <w:rFonts w:ascii="Times New Roman" w:hAnsi="Times New Roman"/>
+                <w:b/>
+                <w:i w:val="0"/>
+                <w:sz w:val="24"/>
+              </w:rPr>
+              <w:t>Пример использования</w:t>
+            </w:r>
+          </w:p>
+        </w:tc>
+      </w:tr>
+      <w:tr>
+        <w:tc>
+          <w:tcPr>
+            <w:tcW w:type="dxa" w:w="3230"/>
+          </w:tcPr>
+          <w:p>
+            <w:pPr>
+              <w:spacing w:before="20" w:after="20"/>
+            </w:pPr>
+            <w:r/>
+            <w:r>
+              <w:rPr>
+                <w:rFonts w:ascii="Times New Roman" w:hAnsi="Times New Roman" w:cs="Times New Roman"/>
+                <w:rFonts w:ascii="Times New Roman" w:hAnsi="Times New Roman"/>
+                <w:b w:val="0"/>
+                <w:i w:val="0"/>
+                <w:sz w:val="22"/>
+              </w:rPr>
+              <w:t>assertEqual(a, b)</w:t>
+            </w:r>
+          </w:p>
+        </w:tc>
+        <w:tc>
+          <w:tcPr>
+            <w:tcW w:type="dxa" w:w="3230"/>
+          </w:tcPr>
+          <w:p>
+            <w:pPr>
+              <w:spacing w:before="20" w:after="20"/>
+            </w:pPr>
+            <w:r/>
+            <w:r>
+              <w:rPr>
+                <w:rFonts w:ascii="Times New Roman" w:hAnsi="Times New Roman" w:cs="Times New Roman"/>
+                <w:rFonts w:ascii="Times New Roman" w:hAnsi="Times New Roman"/>
+                <w:b w:val="0"/>
+                <w:i w:val="0"/>
+                <w:sz w:val="22"/>
+              </w:rPr>
+              <w:t>Проверка равенства</w:t>
+            </w:r>
+          </w:p>
+        </w:tc>
+        <w:tc>
+          <w:tcPr>
+            <w:tcW w:type="dxa" w:w="3230"/>
+          </w:tcPr>
+          <w:p>
+            <w:pPr>
+              <w:spacing w:before="20" w:after="20"/>
+            </w:pPr>
+            <w:r/>
+            <w:r>
+              <w:rPr>
+                <w:rFonts w:ascii="Times New Roman" w:hAnsi="Times New Roman" w:cs="Times New Roman"/>
+                <w:rFonts w:ascii="Times New Roman" w:hAnsi="Times New Roman"/>
+                <w:b w:val="0"/>
+                <w:i w:val="0"/>
+                <w:sz w:val="22"/>
+              </w:rPr>
+              <w:t>self.assertEqual(stack.size(), 1)</w:t>
+            </w:r>
+          </w:p>
+        </w:tc>
+      </w:tr>
+      <w:tr>
+        <w:tc>
+          <w:tcPr>
+            <w:tcW w:type="dxa" w:w="3230"/>
+          </w:tcPr>
+          <w:p>
+            <w:pPr>
+              <w:spacing w:before="20" w:after="20"/>
+            </w:pPr>
+            <w:r/>
+            <w:r>
+              <w:rPr>
+                <w:rFonts w:ascii="Times New Roman" w:hAnsi="Times New Roman" w:cs="Times New Roman"/>
+                <w:rFonts w:ascii="Times New Roman" w:hAnsi="Times New Roman"/>
+                <w:b w:val="0"/>
+                <w:i w:val="0"/>
+                <w:sz w:val="22"/>
+              </w:rPr>
+              <w:t>assertTrue(x)</w:t>
+            </w:r>
+          </w:p>
+        </w:tc>
+        <w:tc>
+          <w:tcPr>
+            <w:tcW w:type="dxa" w:w="3230"/>
+          </w:tcPr>
+          <w:p>
+            <w:pPr>
+              <w:spacing w:before="20" w:after="20"/>
+            </w:pPr>
+            <w:r/>
+            <w:r>
+              <w:rPr>
+                <w:rFonts w:ascii="Times New Roman" w:hAnsi="Times New Roman" w:cs="Times New Roman"/>
+                <w:rFonts w:ascii="Times New Roman" w:hAnsi="Times New Roman"/>
+                <w:b w:val="0"/>
+                <w:i w:val="0"/>
+                <w:sz w:val="22"/>
+              </w:rPr>
+              <w:t>Проверка истинности</w:t>
+            </w:r>
+          </w:p>
+        </w:tc>
+        <w:tc>
+          <w:tcPr>
+            <w:tcW w:type="dxa" w:w="3230"/>
+          </w:tcPr>
+          <w:p>
+            <w:pPr>
+              <w:spacing w:before="20" w:after="20"/>
+            </w:pPr>
+            <w:r/>
+            <w:r>
+              <w:rPr>
+                <w:rFonts w:ascii="Times New Roman" w:hAnsi="Times New Roman" w:cs="Times New Roman"/>
+                <w:rFonts w:ascii="Times New Roman" w:hAnsi="Times New Roman"/>
+                <w:b w:val="0"/>
+                <w:i w:val="0"/>
+                <w:sz w:val="22"/>
+              </w:rPr>
+              <w:t>self.assertTrue(stack.is_empty())</w:t>
+            </w:r>
+          </w:p>
+        </w:tc>
+      </w:tr>
+      <w:tr>
+        <w:tc>
+          <w:tcPr>
+            <w:tcW w:type="dxa" w:w="3230"/>
+          </w:tcPr>
+          <w:p>
+            <w:pPr>
+              <w:spacing w:before="20" w:after="20"/>
+            </w:pPr>
+            <w:r/>
+            <w:r>
+              <w:rPr>
+                <w:rFonts w:ascii="Times New Roman" w:hAnsi="Times New Roman" w:cs="Times New Roman"/>
+                <w:rFonts w:ascii="Times New Roman" w:hAnsi="Times New Roman"/>
+                <w:b w:val="0"/>
+                <w:i w:val="0"/>
+                <w:sz w:val="22"/>
+              </w:rPr>
+              <w:t>assertFalse(x)</w:t>
+            </w:r>
+          </w:p>
+        </w:tc>
+        <w:tc>
+          <w:tcPr>
+            <w:tcW w:type="dxa" w:w="3230"/>
+          </w:tcPr>
+          <w:p>
+            <w:pPr>
+              <w:spacing w:before="20" w:after="20"/>
+            </w:pPr>
+            <w:r/>
+            <w:r>
+              <w:rPr>
+                <w:rFonts w:ascii="Times New Roman" w:hAnsi="Times New Roman" w:cs="Times New Roman"/>
+                <w:rFonts w:ascii="Times New Roman" w:hAnsi="Times New Roman"/>
+                <w:b w:val="0"/>
+                <w:i w:val="0"/>
+                <w:sz w:val="22"/>
+              </w:rPr>
+              <w:t>Проверка ложности</w:t>
+            </w:r>
+          </w:p>
+        </w:tc>
+        <w:tc>
+          <w:tcPr>
+            <w:tcW w:type="dxa" w:w="3230"/>
+          </w:tcPr>
+          <w:p>
+            <w:pPr>
+              <w:spacing w:before="20" w:after="20"/>
+            </w:pPr>
+            <w:r/>
+            <w:r>
+              <w:rPr>
+                <w:rFonts w:ascii="Times New Roman" w:hAnsi="Times New Roman" w:cs="Times New Roman"/>
+                <w:rFonts w:ascii="Times New Roman" w:hAnsi="Times New Roman"/>
+                <w:b w:val="0"/>
+                <w:i w:val="0"/>
+                <w:sz w:val="22"/>
+              </w:rPr>
+              <w:t>self.assertFalse(stack.is_empty())</w:t>
+            </w:r>
+          </w:p>
+        </w:tc>
+      </w:tr>
+      <w:tr>
+        <w:tc>
+          <w:tcPr>
+            <w:tcW w:type="dxa" w:w="3230"/>
+          </w:tcPr>
+          <w:p>
+            <w:pPr>
+              <w:spacing w:before="20" w:after="20"/>
+            </w:pPr>
+            <w:r/>
+            <w:r>
+              <w:rPr>
+                <w:rFonts w:ascii="Times New Roman" w:hAnsi="Times New Roman" w:cs="Times New Roman"/>
+                <w:rFonts w:ascii="Times New Roman" w:hAnsi="Times New Roman"/>
+                <w:b w:val="0"/>
+                <w:i w:val="0"/>
+                <w:sz w:val="22"/>
+              </w:rPr>
+              <w:t>assertRaises(exc)</w:t>
+            </w:r>
+          </w:p>
+        </w:tc>
+        <w:tc>
+          <w:tcPr>
+            <w:tcW w:type="dxa" w:w="3230"/>
+          </w:tcPr>
+          <w:p>
+            <w:pPr>
+              <w:spacing w:before="20" w:after="20"/>
+            </w:pPr>
+            <w:r/>
+            <w:r>
+              <w:rPr>
+                <w:rFonts w:ascii="Times New Roman" w:hAnsi="Times New Roman" w:cs="Times New Roman"/>
+                <w:rFonts w:ascii="Times New Roman" w:hAnsi="Times New Roman"/>
+                <w:b w:val="0"/>
+                <w:i w:val="0"/>
+                <w:sz w:val="22"/>
+              </w:rPr>
+              <w:t>Проверка исключения</w:t>
+            </w:r>
+          </w:p>
+        </w:tc>
+        <w:tc>
+          <w:tcPr>
+            <w:tcW w:type="dxa" w:w="3230"/>
+          </w:tcPr>
+          <w:p>
+            <w:pPr>
+              <w:spacing w:before="20" w:after="20"/>
+            </w:pPr>
+            <w:r/>
+            <w:r>
+              <w:rPr>
+                <w:rFonts w:ascii="Times New Roman" w:hAnsi="Times New Roman" w:cs="Times New Roman"/>
+                <w:rFonts w:ascii="Times New Roman" w:hAnsi="Times New Roman"/>
+                <w:b w:val="0"/>
+                <w:i w:val="0"/>
+                <w:sz w:val="22"/>
+              </w:rPr>
+              <w:t>with self.assertRaises(IndexError): stack.pop()</w:t>
+            </w:r>
+          </w:p>
+        </w:tc>
+      </w:tr>
+      <w:tr>
+        <w:tc>
+          <w:tcPr>
+            <w:tcW w:type="dxa" w:w="3230"/>
+          </w:tcPr>
+          <w:p>
+            <w:pPr>
+              <w:spacing w:before="20" w:after="20"/>
+            </w:pPr>
+            <w:r/>
+            <w:r>
+              <w:rPr>
+                <w:rFonts w:ascii="Times New Roman" w:hAnsi="Times New Roman" w:cs="Times New Roman"/>
+                <w:rFonts w:ascii="Times New Roman" w:hAnsi="Times New Roman"/>
+                <w:b w:val="0"/>
+                <w:i w:val="0"/>
+                <w:sz w:val="22"/>
+              </w:rPr>
+              <w:t>assertAlmostEqual(a, b)</w:t>
+            </w:r>
+          </w:p>
+        </w:tc>
+        <w:tc>
+          <w:tcPr>
+            <w:tcW w:type="dxa" w:w="3230"/>
+          </w:tcPr>
+          <w:p>
+            <w:pPr>
+              <w:spacing w:before="20" w:after="20"/>
+            </w:pPr>
+            <w:r/>
+            <w:r>
+              <w:rPr>
+                <w:rFonts w:ascii="Times New Roman" w:hAnsi="Times New Roman" w:cs="Times New Roman"/>
+                <w:rFonts w:ascii="Times New Roman" w:hAnsi="Times New Roman"/>
+                <w:b w:val="0"/>
+                <w:i w:val="0"/>
+                <w:sz w:val="22"/>
+              </w:rPr>
+              <w:t>Проверка приблизительного равенства float</w:t>
+            </w:r>
+          </w:p>
+        </w:tc>
+        <w:tc>
+          <w:tcPr>
+            <w:tcW w:type="dxa" w:w="3230"/>
+          </w:tcPr>
+          <w:p>
+            <w:pPr>
+              <w:spacing w:before="20" w:after="20"/>
+            </w:pPr>
+            <w:r/>
+            <w:r>
+              <w:rPr>
+                <w:rFonts w:ascii="Times New Roman" w:hAnsi="Times New Roman" w:cs="Times New Roman"/>
+                <w:rFonts w:ascii="Times New Roman" w:hAnsi="Times New Roman"/>
+                <w:b w:val="0"/>
+                <w:i w:val="0"/>
+                <w:sz w:val="22"/>
+              </w:rPr>
+              <w:t>self.assertAlmostEqual(stack.pop(), 3.14)</w:t>
+            </w:r>
+          </w:p>
+        </w:tc>
+      </w:tr>
+    </w:tbl>
+    <w:p>
+      <w:pPr>
+        <w:spacing w:before="0" w:after="120"/>
+      </w:pPr>
+    </w:p>
+    <w:p>
+      <w:pPr>
+        <w:spacing w:before="160" w:after="80" w:line="360" w:lineRule="auto"/>
+        <w:ind w:firstLine="0"/>
+        <w:jc w:val="left"/>
+      </w:pPr>
+      <w:r>
+        <w:rPr>
+          <w:rFonts w:ascii="Times New Roman" w:hAnsi="Times New Roman" w:cs="Times New Roman"/>
+          <w:rFonts w:ascii="Times New Roman" w:hAnsi="Times New Roman"/>
+          <w:b/>
+          <w:i w:val="0"/>
+          <w:sz w:val="28"/>
+        </w:rPr>
+        <w:t>7. Код программы</w:t>
+      </w:r>
+    </w:p>
+    <w:p>
+      <w:pPr>
         <w:spacing w:before="0" w:after="0" w:line="360" w:lineRule="auto"/>
         <w:ind w:firstLine="709"/>
-        <w:jc w:val="left"/>
+        <w:jc w:val="both"/>
       </w:pPr>
       <w:r>
         <w:rPr>
@@ -959,7 +2125,7 @@
           <w:i w:val="0"/>
           <w:sz w:val="28"/>
         </w:rPr>
-        <w:t>Полный код модуля с реализацией класса Stack и модульными тестами приведён ниже.</w:t>
+        <w:t>Полный код модуля с реализацией класса Stack и набором модульных тестов:</w:t>
       </w:r>
     </w:p>
     <w:p>
@@ -2191,7 +3357,7 @@
           <w:rFonts w:ascii="Courier New" w:hAnsi="Courier New"/>
           <w:sz w:val="20"/>
         </w:rPr>
-        <w:t xml:space="preserve">        self.assertEqual(self.stack.pop(), "второй")</w:t>
+        <w:t xml:space="preserve"> </w:t>
       </w:r>
     </w:p>
     <w:p>
@@ -2213,7 +3379,7 @@
           <w:rFonts w:ascii="Courier New" w:hAnsi="Courier New"/>
           <w:sz w:val="20"/>
         </w:rPr>
-        <w:t xml:space="preserve">        self.assertEqual(self.stack.pop(), "первый")</w:t>
+        <w:t xml:space="preserve">    def test_pop_empty_stack_raises_index_error(self):</w:t>
       </w:r>
     </w:p>
     <w:p>
@@ -2235,7 +3401,7 @@
           <w:rFonts w:ascii="Courier New" w:hAnsi="Courier New"/>
           <w:sz w:val="20"/>
         </w:rPr>
-        <w:t xml:space="preserve"> </w:t>
+        <w:t xml:space="preserve">        with self.assertRaises(IndexError):</w:t>
       </w:r>
     </w:p>
     <w:p>
@@ -2257,7 +3423,7 @@
           <w:rFonts w:ascii="Courier New" w:hAnsi="Courier New"/>
           <w:sz w:val="20"/>
         </w:rPr>
-        <w:t xml:space="preserve">    def test_pop_empty_stack_raises_index_error(self):</w:t>
+        <w:t xml:space="preserve">            self.stack.pop()</w:t>
       </w:r>
     </w:p>
     <w:p>
@@ -2279,7 +3445,7 @@
           <w:rFonts w:ascii="Courier New" w:hAnsi="Courier New"/>
           <w:sz w:val="20"/>
         </w:rPr>
-        <w:t xml:space="preserve">        with self.assertRaises(IndexError):</w:t>
+        <w:t xml:space="preserve"> </w:t>
       </w:r>
     </w:p>
     <w:p>
@@ -2301,7 +3467,7 @@
           <w:rFonts w:ascii="Courier New" w:hAnsi="Courier New"/>
           <w:sz w:val="20"/>
         </w:rPr>
-        <w:t xml:space="preserve">            self.stack.pop()</w:t>
+        <w:t xml:space="preserve">    def test_peek_returns_top_without_removing(self):</w:t>
       </w:r>
     </w:p>
     <w:p>
@@ -2323,7 +3489,7 @@
           <w:rFonts w:ascii="Courier New" w:hAnsi="Courier New"/>
           <w:sz w:val="20"/>
         </w:rPr>
-        <w:t xml:space="preserve"> </w:t>
+        <w:t xml:space="preserve">        self.stack.push(100)</w:t>
       </w:r>
     </w:p>
     <w:p>
@@ -2345,7 +3511,7 @@
           <w:rFonts w:ascii="Courier New" w:hAnsi="Courier New"/>
           <w:sz w:val="20"/>
         </w:rPr>
-        <w:t xml:space="preserve">    def test_peek_returns_top_without_removing(self):</w:t>
+        <w:t xml:space="preserve">        self.stack.push(200)</w:t>
       </w:r>
     </w:p>
     <w:p>
@@ -2367,7 +3533,7 @@
           <w:rFonts w:ascii="Courier New" w:hAnsi="Courier New"/>
           <w:sz w:val="20"/>
         </w:rPr>
-        <w:t xml:space="preserve">        self.stack.push(100)</w:t>
+        <w:t xml:space="preserve">        self.assertEqual(self.stack.peek(), 200)</w:t>
       </w:r>
     </w:p>
     <w:p>
@@ -2389,7 +3555,7 @@
           <w:rFonts w:ascii="Courier New" w:hAnsi="Courier New"/>
           <w:sz w:val="20"/>
         </w:rPr>
-        <w:t xml:space="preserve">        self.stack.push(200)</w:t>
+        <w:t xml:space="preserve">        self.assertEqual(self.stack.size(), 2)</w:t>
       </w:r>
     </w:p>
     <w:p>
@@ -2411,7 +3577,7 @@
           <w:rFonts w:ascii="Courier New" w:hAnsi="Courier New"/>
           <w:sz w:val="20"/>
         </w:rPr>
-        <w:t xml:space="preserve">        result = self.stack.peek()</w:t>
+        <w:t xml:space="preserve"> </w:t>
       </w:r>
     </w:p>
     <w:p>
@@ -2433,7 +3599,7 @@
           <w:rFonts w:ascii="Courier New" w:hAnsi="Courier New"/>
           <w:sz w:val="20"/>
         </w:rPr>
-        <w:t xml:space="preserve">        self.assertEqual(result, 200)</w:t>
+        <w:t xml:space="preserve">    def test_peek_empty_stack_raises_index_error(self):</w:t>
       </w:r>
     </w:p>
     <w:p>
@@ -2455,7 +3621,7 @@
           <w:rFonts w:ascii="Courier New" w:hAnsi="Courier New"/>
           <w:sz w:val="20"/>
         </w:rPr>
-        <w:t xml:space="preserve">        self.assertEqual(self.stack.size(), 2)</w:t>
+        <w:t xml:space="preserve">        with self.assertRaises(IndexError):</w:t>
       </w:r>
     </w:p>
     <w:p>
@@ -2477,7 +3643,7 @@
           <w:rFonts w:ascii="Courier New" w:hAnsi="Courier New"/>
           <w:sz w:val="20"/>
         </w:rPr>
-        <w:t xml:space="preserve"> </w:t>
+        <w:t xml:space="preserve">            self.stack.peek()</w:t>
       </w:r>
     </w:p>
     <w:p>
@@ -2499,7 +3665,7 @@
           <w:rFonts w:ascii="Courier New" w:hAnsi="Courier New"/>
           <w:sz w:val="20"/>
         </w:rPr>
-        <w:t xml:space="preserve">    def test_peek_empty_stack_raises_index_error(self):</w:t>
+        <w:t xml:space="preserve"> </w:t>
       </w:r>
     </w:p>
     <w:p>
@@ -2521,7 +3687,7 @@
           <w:rFonts w:ascii="Courier New" w:hAnsi="Courier New"/>
           <w:sz w:val="20"/>
         </w:rPr>
-        <w:t xml:space="preserve">        with self.assertRaises(IndexError):</w:t>
+        <w:t xml:space="preserve">    def test_is_empty_on_new_stack(self):</w:t>
       </w:r>
     </w:p>
     <w:p>
@@ -2543,7 +3709,7 @@
           <w:rFonts w:ascii="Courier New" w:hAnsi="Courier New"/>
           <w:sz w:val="20"/>
         </w:rPr>
-        <w:t xml:space="preserve">            self.stack.peek()</w:t>
+        <w:t xml:space="preserve">        self.assertTrue(self.stack.is_empty())</w:t>
       </w:r>
     </w:p>
     <w:p>
@@ -2587,7 +3753,7 @@
           <w:rFonts w:ascii="Courier New" w:hAnsi="Courier New"/>
           <w:sz w:val="20"/>
         </w:rPr>
-        <w:t xml:space="preserve">    def test_is_empty_on_new_stack(self):</w:t>
+        <w:t xml:space="preserve">    def test_is_empty_after_push_and_pop(self):</w:t>
       </w:r>
     </w:p>
     <w:p>
@@ -2609,7 +3775,7 @@
           <w:rFonts w:ascii="Courier New" w:hAnsi="Courier New"/>
           <w:sz w:val="20"/>
         </w:rPr>
-        <w:t xml:space="preserve">        self.assertTrue(self.stack.is_empty())</w:t>
+        <w:t xml:space="preserve">        self.stack.push(1)</w:t>
       </w:r>
     </w:p>
     <w:p>
@@ -2631,7 +3797,7 @@
           <w:rFonts w:ascii="Courier New" w:hAnsi="Courier New"/>
           <w:sz w:val="20"/>
         </w:rPr>
-        <w:t xml:space="preserve"> </w:t>
+        <w:t xml:space="preserve">        self.stack.push(2)</w:t>
       </w:r>
     </w:p>
     <w:p>
@@ -2653,7 +3819,7 @@
           <w:rFonts w:ascii="Courier New" w:hAnsi="Courier New"/>
           <w:sz w:val="20"/>
         </w:rPr>
-        <w:t xml:space="preserve">    def test_is_empty_after_push_and_pop(self):</w:t>
+        <w:t xml:space="preserve">        self.stack.pop()</w:t>
       </w:r>
     </w:p>
     <w:p>
@@ -2675,7 +3841,7 @@
           <w:rFonts w:ascii="Courier New" w:hAnsi="Courier New"/>
           <w:sz w:val="20"/>
         </w:rPr>
-        <w:t xml:space="preserve">        self.stack.push(1)</w:t>
+        <w:t xml:space="preserve">        self.stack.pop()</w:t>
       </w:r>
     </w:p>
     <w:p>
@@ -2697,7 +3863,7 @@
           <w:rFonts w:ascii="Courier New" w:hAnsi="Courier New"/>
           <w:sz w:val="20"/>
         </w:rPr>
-        <w:t xml:space="preserve">        self.stack.push(2)</w:t>
+        <w:t xml:space="preserve">        self.assertTrue(self.stack.is_empty())</w:t>
       </w:r>
     </w:p>
     <w:p>
@@ -2719,7 +3885,7 @@
           <w:rFonts w:ascii="Courier New" w:hAnsi="Courier New"/>
           <w:sz w:val="20"/>
         </w:rPr>
-        <w:t xml:space="preserve">        self.stack.pop()</w:t>
+        <w:t xml:space="preserve"> </w:t>
       </w:r>
     </w:p>
     <w:p>
@@ -2741,7 +3907,7 @@
           <w:rFonts w:ascii="Courier New" w:hAnsi="Courier New"/>
           <w:sz w:val="20"/>
         </w:rPr>
-        <w:t xml:space="preserve">        self.stack.pop()</w:t>
+        <w:t xml:space="preserve">    def test_clear_empties_the_stack(self):</w:t>
       </w:r>
     </w:p>
     <w:p>
@@ -2763,7 +3929,7 @@
           <w:rFonts w:ascii="Courier New" w:hAnsi="Courier New"/>
           <w:sz w:val="20"/>
         </w:rPr>
-        <w:t xml:space="preserve">        self.assertTrue(self.stack.is_empty())</w:t>
+        <w:t xml:space="preserve">        for i in range(5):</w:t>
       </w:r>
     </w:p>
     <w:p>
@@ -2785,7 +3951,7 @@
           <w:rFonts w:ascii="Courier New" w:hAnsi="Courier New"/>
           <w:sz w:val="20"/>
         </w:rPr>
-        <w:t xml:space="preserve"> </w:t>
+        <w:t xml:space="preserve">            self.stack.push(i)</w:t>
       </w:r>
     </w:p>
     <w:p>
@@ -2807,7 +3973,7 @@
           <w:rFonts w:ascii="Courier New" w:hAnsi="Courier New"/>
           <w:sz w:val="20"/>
         </w:rPr>
-        <w:t xml:space="preserve">    def test_clear_empties_the_stack(self):</w:t>
+        <w:t xml:space="preserve">        self.stack.clear()</w:t>
       </w:r>
     </w:p>
     <w:p>
@@ -2829,7 +3995,7 @@
           <w:rFonts w:ascii="Courier New" w:hAnsi="Courier New"/>
           <w:sz w:val="20"/>
         </w:rPr>
-        <w:t xml:space="preserve">        for i in range(5):</w:t>
+        <w:t xml:space="preserve">        self.assertTrue(self.stack.is_empty())</w:t>
       </w:r>
     </w:p>
     <w:p>
@@ -2851,7 +4017,7 @@
           <w:rFonts w:ascii="Courier New" w:hAnsi="Courier New"/>
           <w:sz w:val="20"/>
         </w:rPr>
-        <w:t xml:space="preserve">            self.stack.push(i)</w:t>
+        <w:t xml:space="preserve">        self.assertEqual(self.stack.size(), 0)</w:t>
       </w:r>
     </w:p>
     <w:p>
@@ -2873,7 +4039,7 @@
           <w:rFonts w:ascii="Courier New" w:hAnsi="Courier New"/>
           <w:sz w:val="20"/>
         </w:rPr>
-        <w:t xml:space="preserve">        self.stack.clear()</w:t>
+        <w:t xml:space="preserve"> </w:t>
       </w:r>
     </w:p>
     <w:p>
@@ -2895,7 +4061,7 @@
           <w:rFonts w:ascii="Courier New" w:hAnsi="Courier New"/>
           <w:sz w:val="20"/>
         </w:rPr>
-        <w:t xml:space="preserve">        self.assertTrue(self.stack.is_empty())</w:t>
+        <w:t xml:space="preserve">    def test_push_mixed_types(self):</w:t>
       </w:r>
     </w:p>
     <w:p>
@@ -2917,7 +4083,7 @@
           <w:rFonts w:ascii="Courier New" w:hAnsi="Courier New"/>
           <w:sz w:val="20"/>
         </w:rPr>
-        <w:t xml:space="preserve">        self.assertEqual(self.stack.size(), 0)</w:t>
+        <w:t xml:space="preserve">        self.stack.push(1)</w:t>
       </w:r>
     </w:p>
     <w:p>
@@ -2939,7 +4105,7 @@
           <w:rFonts w:ascii="Courier New" w:hAnsi="Courier New"/>
           <w:sz w:val="20"/>
         </w:rPr>
-        <w:t xml:space="preserve"> </w:t>
+        <w:t xml:space="preserve">        self.stack.push("текст")</w:t>
       </w:r>
     </w:p>
     <w:p>
@@ -2961,7 +4127,7 @@
           <w:rFonts w:ascii="Courier New" w:hAnsi="Courier New"/>
           <w:sz w:val="20"/>
         </w:rPr>
-        <w:t xml:space="preserve">    def test_push_mixed_types(self):</w:t>
+        <w:t xml:space="preserve">        self.stack.push(3.14)</w:t>
       </w:r>
     </w:p>
     <w:p>
@@ -2983,7 +4149,7 @@
           <w:rFonts w:ascii="Courier New" w:hAnsi="Courier New"/>
           <w:sz w:val="20"/>
         </w:rPr>
-        <w:t xml:space="preserve">        self.stack.push(1)</w:t>
+        <w:t xml:space="preserve">        self.stack.push([1, 2, 3])</w:t>
       </w:r>
     </w:p>
     <w:p>
@@ -3005,7 +4171,7 @@
           <w:rFonts w:ascii="Courier New" w:hAnsi="Courier New"/>
           <w:sz w:val="20"/>
         </w:rPr>
-        <w:t xml:space="preserve">        self.stack.push("текст")</w:t>
+        <w:t xml:space="preserve">        self.assertEqual(self.stack.size(), 4)</w:t>
       </w:r>
     </w:p>
     <w:p>
@@ -3027,7 +4193,7 @@
           <w:rFonts w:ascii="Courier New" w:hAnsi="Courier New"/>
           <w:sz w:val="20"/>
         </w:rPr>
-        <w:t xml:space="preserve">        self.stack.push(3.14)</w:t>
+        <w:t xml:space="preserve">        self.assertEqual(self.stack.pop(), [1, 2, 3])</w:t>
       </w:r>
     </w:p>
     <w:p>
@@ -3049,7 +4215,7 @@
           <w:rFonts w:ascii="Courier New" w:hAnsi="Courier New"/>
           <w:sz w:val="20"/>
         </w:rPr>
-        <w:t xml:space="preserve">        self.stack.push([1, 2, 3])</w:t>
+        <w:t xml:space="preserve">        self.assertAlmostEqual(self.stack.pop(), 3.14)</w:t>
       </w:r>
     </w:p>
     <w:p>
@@ -3071,7 +4237,7 @@
           <w:rFonts w:ascii="Courier New" w:hAnsi="Courier New"/>
           <w:sz w:val="20"/>
         </w:rPr>
-        <w:t xml:space="preserve">        self.assertEqual(self.stack.size(), 4)</w:t>
+        <w:t xml:space="preserve"> </w:t>
       </w:r>
     </w:p>
     <w:p>
@@ -3093,7 +4259,7 @@
           <w:rFonts w:ascii="Courier New" w:hAnsi="Courier New"/>
           <w:sz w:val="20"/>
         </w:rPr>
-        <w:t xml:space="preserve">        self.assertEqual(self.stack.pop(), [1, 2, 3])</w:t>
+        <w:t xml:space="preserve"> </w:t>
       </w:r>
     </w:p>
     <w:p>
@@ -3115,7 +4281,7 @@
           <w:rFonts w:ascii="Courier New" w:hAnsi="Courier New"/>
           <w:sz w:val="20"/>
         </w:rPr>
-        <w:t xml:space="preserve"> </w:t>
+        <w:t>if __name__ == "__main__":</w:t>
       </w:r>
     </w:p>
     <w:p>
@@ -3137,7 +4303,58 @@
           <w:rFonts w:ascii="Courier New" w:hAnsi="Courier New"/>
           <w:sz w:val="20"/>
         </w:rPr>
-        <w:t xml:space="preserve"> </w:t>
+        <w:t xml:space="preserve">    unittest.main(verbosity=2)</w:t>
+      </w:r>
+    </w:p>
+    <w:p>
+      <w:pPr>
+        <w:spacing w:before="40" w:after="120"/>
+        <w:ind w:firstLine="0"/>
+        <w:jc w:val="center"/>
+      </w:pPr>
+      <w:r>
+        <w:rPr>
+          <w:rFonts w:ascii="Times New Roman" w:hAnsi="Times New Roman" w:cs="Times New Roman"/>
+          <w:rFonts w:ascii="Times New Roman" w:hAnsi="Times New Roman"/>
+          <w:b w:val="0"/>
+          <w:i/>
+          <w:sz w:val="24"/>
+        </w:rPr>
+        <w:t>Рис. 1. Реализация класса Stack и модульных тестов (main.py)</w:t>
+      </w:r>
+    </w:p>
+    <w:p>
+      <w:pPr>
+        <w:spacing w:before="160" w:after="80" w:line="360" w:lineRule="auto"/>
+        <w:ind w:firstLine="0"/>
+        <w:jc w:val="left"/>
+      </w:pPr>
+      <w:r>
+        <w:rPr>
+          <w:rFonts w:ascii="Times New Roman" w:hAnsi="Times New Roman" w:cs="Times New Roman"/>
+          <w:rFonts w:ascii="Times New Roman" w:hAnsi="Times New Roman"/>
+          <w:b/>
+          <w:i w:val="0"/>
+          <w:sz w:val="28"/>
+        </w:rPr>
+        <w:t>8. Демонстрация работы программы</w:t>
+      </w:r>
+    </w:p>
+    <w:p>
+      <w:pPr>
+        <w:spacing w:before="0" w:after="0" w:line="360" w:lineRule="auto"/>
+        <w:ind w:firstLine="709"/>
+        <w:jc w:val="both"/>
+      </w:pPr>
+      <w:r>
+        <w:rPr>
+          <w:rFonts w:ascii="Times New Roman" w:hAnsi="Times New Roman" w:cs="Times New Roman"/>
+          <w:rFonts w:ascii="Times New Roman" w:hAnsi="Times New Roman"/>
+          <w:b w:val="0"/>
+          <w:i w:val="0"/>
+          <w:sz w:val="28"/>
+        </w:rPr>
+        <w:t>Тесты запущены командой python main.py с использованием unittest.TextTestRunner(verbosity=2). Консольный вывод:</w:t>
       </w:r>
     </w:p>
     <w:p>
@@ -3159,7 +4376,7 @@
           <w:rFonts w:ascii="Courier New" w:hAnsi="Courier New"/>
           <w:sz w:val="20"/>
         </w:rPr>
-        <w:t>def run_tests():</w:t>
+        <w:t>test_clear_empties_the_stack (__main__.TestStack.test_clear_empties_the_stack)</w:t>
       </w:r>
     </w:p>
     <w:p>
@@ -3181,7 +4398,7 @@
           <w:rFonts w:ascii="Courier New" w:hAnsi="Courier New"/>
           <w:sz w:val="20"/>
         </w:rPr>
-        <w:t xml:space="preserve">    loader = unittest.TestLoader()</w:t>
+        <w:t>Метод clear должен полностью опустошить стек. ... ok</w:t>
       </w:r>
     </w:p>
     <w:p>
@@ -3203,7 +4420,7 @@
           <w:rFonts w:ascii="Courier New" w:hAnsi="Courier New"/>
           <w:sz w:val="20"/>
         </w:rPr>
-        <w:t xml:space="preserve">    suite = unittest.TestSuite()</w:t>
+        <w:t>test_is_empty_after_push_and_pop (__main__.TestStack.test_is_empty_after_push_and_pop)</w:t>
       </w:r>
     </w:p>
     <w:p>
@@ -3225,7 +4442,7 @@
           <w:rFonts w:ascii="Courier New" w:hAnsi="Courier New"/>
           <w:sz w:val="20"/>
         </w:rPr>
-        <w:t xml:space="preserve">    suite.addTests(loader.loadTestsFromTestCase(TestStack))</w:t>
+        <w:t>Стек должен стать пустым после удаления всех элементов. ... ok</w:t>
       </w:r>
     </w:p>
     <w:p>
@@ -3247,7 +4464,7 @@
           <w:rFonts w:ascii="Courier New" w:hAnsi="Courier New"/>
           <w:sz w:val="20"/>
         </w:rPr>
-        <w:t xml:space="preserve">    runner = unittest.TextTestRunner(verbosity=2)</w:t>
+        <w:t>test_is_empty_on_new_stack (__main__.TestStack.test_is_empty_on_new_stack)</w:t>
       </w:r>
     </w:p>
     <w:p>
@@ -3269,7 +4486,7 @@
           <w:rFonts w:ascii="Courier New" w:hAnsi="Courier New"/>
           <w:sz w:val="20"/>
         </w:rPr>
-        <w:t xml:space="preserve">    result = runner.run(suite)</w:t>
+        <w:t>Новый стек должен быть пустым. ... ok</w:t>
       </w:r>
     </w:p>
     <w:p>
@@ -3291,7 +4508,7 @@
           <w:rFonts w:ascii="Courier New" w:hAnsi="Courier New"/>
           <w:sz w:val="20"/>
         </w:rPr>
-        <w:t xml:space="preserve">    print("\n" + "=" * 60)</w:t>
+        <w:t>test_peek_empty_stack_raises_index_error (__main__.TestStack.test_peek_empty_stack_raises_index_error)</w:t>
       </w:r>
     </w:p>
     <w:p>
@@ -3313,7 +4530,7 @@
           <w:rFonts w:ascii="Courier New" w:hAnsi="Courier New"/>
           <w:sz w:val="20"/>
         </w:rPr>
-        <w:t xml:space="preserve">    print("ИТОГИ ТЕСТИРОВАНИЯ")</w:t>
+        <w:t>Проверяет, что peek на пустом стеке вызывает IndexError. ... ok</w:t>
       </w:r>
     </w:p>
     <w:p>
@@ -3335,7 +4552,7 @@
           <w:rFonts w:ascii="Courier New" w:hAnsi="Courier New"/>
           <w:sz w:val="20"/>
         </w:rPr>
-        <w:t xml:space="preserve">    print("=" * 60)</w:t>
+        <w:t>test_peek_returns_top_without_removing (__main__.TestStack.test_peek_returns_top_without_removing)</w:t>
       </w:r>
     </w:p>
     <w:p>
@@ -3357,7 +4574,7 @@
           <w:rFonts w:ascii="Courier New" w:hAnsi="Courier New"/>
           <w:sz w:val="20"/>
         </w:rPr>
-        <w:t xml:space="preserve">    print(f"  Всего тестов : {result.testsRun}")</w:t>
+        <w:t>Проверяет, что peek возвращает вершину, не изменяя стек. ... ok</w:t>
       </w:r>
     </w:p>
     <w:p>
@@ -3379,7 +4596,7 @@
           <w:rFonts w:ascii="Courier New" w:hAnsi="Courier New"/>
           <w:sz w:val="20"/>
         </w:rPr>
-        <w:t xml:space="preserve">    print(f"  Успешно      : {result.testsRun - len(result.failures) - len(result.errors)}")</w:t>
+        <w:t>test_pop_empty_stack_raises_index_error (__main__.TestStack.test_pop_empty_stack_raises_index_error)</w:t>
       </w:r>
     </w:p>
     <w:p>
@@ -3401,7 +4618,7 @@
           <w:rFonts w:ascii="Courier New" w:hAnsi="Courier New"/>
           <w:sz w:val="20"/>
         </w:rPr>
-        <w:t xml:space="preserve">    print(f"  Провалов     : {len(result.failures)}")</w:t>
+        <w:t>Проверяет, что pop на пустом стеке вызывает IndexError. ... ok</w:t>
       </w:r>
     </w:p>
     <w:p>
@@ -3423,7 +4640,7 @@
           <w:rFonts w:ascii="Courier New" w:hAnsi="Courier New"/>
           <w:sz w:val="20"/>
         </w:rPr>
-        <w:t xml:space="preserve">    print(f"  Ошибок       : {len(result.errors)}")</w:t>
+        <w:t>test_pop_returns_last_pushed (__main__.TestStack.test_pop_returns_last_pushed)</w:t>
       </w:r>
     </w:p>
     <w:p>
@@ -3445,7 +4662,7 @@
           <w:rFonts w:ascii="Courier New" w:hAnsi="Courier New"/>
           <w:sz w:val="20"/>
         </w:rPr>
-        <w:t xml:space="preserve">    print("=" * 60)</w:t>
+        <w:t>Проверяет принцип LIFO. ... ok</w:t>
       </w:r>
     </w:p>
     <w:p>
@@ -3467,7 +4684,7 @@
           <w:rFonts w:ascii="Courier New" w:hAnsi="Courier New"/>
           <w:sz w:val="20"/>
         </w:rPr>
-        <w:t xml:space="preserve">    return result.wasSuccessful()</w:t>
+        <w:t>test_push_mixed_types (__main__.TestStack.test_push_mixed_types)</w:t>
       </w:r>
     </w:p>
     <w:p>
@@ -3489,7 +4706,7 @@
           <w:rFonts w:ascii="Courier New" w:hAnsi="Courier New"/>
           <w:sz w:val="20"/>
         </w:rPr>
-        <w:t xml:space="preserve"> </w:t>
+        <w:t>Стек должен корректно хранить элементы разных типов. ... ok</w:t>
       </w:r>
     </w:p>
     <w:p>
@@ -3511,7 +4728,7 @@
           <w:rFonts w:ascii="Courier New" w:hAnsi="Courier New"/>
           <w:sz w:val="20"/>
         </w:rPr>
-        <w:t xml:space="preserve"> </w:t>
+        <w:t>test_push_multiple_elements (__main__.TestStack.test_push_multiple_elements)</w:t>
       </w:r>
     </w:p>
     <w:p>
@@ -3533,7 +4750,7 @@
           <w:rFonts w:ascii="Courier New" w:hAnsi="Courier New"/>
           <w:sz w:val="20"/>
         </w:rPr>
-        <w:t>if __name__ == "__main__":</w:t>
+        <w:t>Проверяет корректный подсчёт размера при последовательных push. ... ok</w:t>
       </w:r>
     </w:p>
     <w:p>
@@ -3555,40 +4772,7 @@
           <w:rFonts w:ascii="Courier New" w:hAnsi="Courier New"/>
           <w:sz w:val="20"/>
         </w:rPr>
-        <w:t xml:space="preserve">    run_tests()</w:t>
-      </w:r>
-    </w:p>
-    <w:p>
-      <w:pPr>
-        <w:spacing w:before="120" w:after="60" w:line="360" w:lineRule="auto"/>
-        <w:ind w:firstLine="0"/>
-        <w:jc w:val="left"/>
-      </w:pPr>
-      <w:r>
-        <w:rPr>
-          <w:rFonts w:ascii="Times New Roman" w:hAnsi="Times New Roman" w:cs="Times New Roman"/>
-          <w:rFonts w:ascii="Times New Roman" w:hAnsi="Times New Roman"/>
-          <w:b/>
-          <w:sz w:val="28"/>
-        </w:rPr>
-        <w:t>Демонстрация работы программы</w:t>
-      </w:r>
-    </w:p>
-    <w:p>
-      <w:pPr>
-        <w:spacing w:before="0" w:after="0" w:line="360" w:lineRule="auto"/>
-        <w:ind w:firstLine="709"/>
-        <w:jc w:val="left"/>
-      </w:pPr>
-      <w:r>
-        <w:rPr>
-          <w:rFonts w:ascii="Times New Roman" w:hAnsi="Times New Roman" w:cs="Times New Roman"/>
-          <w:rFonts w:ascii="Times New Roman" w:hAnsi="Times New Roman"/>
-          <w:b w:val="0"/>
-          <w:i w:val="0"/>
-          <w:sz w:val="28"/>
-        </w:rPr>
-        <w:t>Тесты были запущены с помощью unittest.TextTestRunner(verbosity=2). Вывод консоли при выполнении программы представлен ниже.</w:t>
+        <w:t>test_push_single_element (__main__.TestStack.test_push_single_element)</w:t>
       </w:r>
     </w:p>
     <w:p>
@@ -3610,7 +4794,7 @@
           <w:rFonts w:ascii="Courier New" w:hAnsi="Courier New"/>
           <w:sz w:val="20"/>
         </w:rPr>
-        <w:t>test_clear_empties_the_stack (__main__.TestStack.test_clear_empties_the_stack)</w:t>
+        <w:t>Проверяет, что после push стек не пустой и размер равен 1. ... ok</w:t>
       </w:r>
     </w:p>
     <w:p>
@@ -3632,7 +4816,7 @@
           <w:rFonts w:ascii="Courier New" w:hAnsi="Courier New"/>
           <w:sz w:val="20"/>
         </w:rPr>
-        <w:t>Метод clear должен полностью опустошить стек. ... ok</w:t>
+        <w:t xml:space="preserve"> </w:t>
       </w:r>
     </w:p>
     <w:p>
@@ -3654,7 +4838,7 @@
           <w:rFonts w:ascii="Courier New" w:hAnsi="Courier New"/>
           <w:sz w:val="20"/>
         </w:rPr>
-        <w:t>test_is_empty_after_push_and_pop (__main__.TestStack.test_is_empty_after_push_and_pop)</w:t>
+        <w:t>----------------------------------------------------------------------</w:t>
       </w:r>
     </w:p>
     <w:p>
@@ -3676,7 +4860,7 @@
           <w:rFonts w:ascii="Courier New" w:hAnsi="Courier New"/>
           <w:sz w:val="20"/>
         </w:rPr>
-        <w:t>Стек должен стать пустым после удаления всех элементов. ... ok</w:t>
+        <w:t>Ran 10 tests in 0.001s</w:t>
       </w:r>
     </w:p>
     <w:p>
@@ -3698,7 +4882,7 @@
           <w:rFonts w:ascii="Courier New" w:hAnsi="Courier New"/>
           <w:sz w:val="20"/>
         </w:rPr>
-        <w:t>test_is_empty_on_new_stack (__main__.TestStack.test_is_empty_on_new_stack)</w:t>
+        <w:t xml:space="preserve"> </w:t>
       </w:r>
     </w:p>
     <w:p>
@@ -3720,7 +4904,7 @@
           <w:rFonts w:ascii="Courier New" w:hAnsi="Courier New"/>
           <w:sz w:val="20"/>
         </w:rPr>
-        <w:t>Новый стек должен быть пустым. ... ok</w:t>
+        <w:t>OK</w:t>
       </w:r>
     </w:p>
     <w:p>
@@ -3742,7 +4926,7 @@
           <w:rFonts w:ascii="Courier New" w:hAnsi="Courier New"/>
           <w:sz w:val="20"/>
         </w:rPr>
-        <w:t>test_peek_empty_stack_raises_index_error (__main__.TestStack.test_peek_empty_stack_raises_index_error)</w:t>
+        <w:t xml:space="preserve"> </w:t>
       </w:r>
     </w:p>
     <w:p>
@@ -3764,7 +4948,7 @@
           <w:rFonts w:ascii="Courier New" w:hAnsi="Courier New"/>
           <w:sz w:val="20"/>
         </w:rPr>
-        <w:t>Проверяет, что peek на пустом стеке вызывает IndexError. ... ok</w:t>
+        <w:t>============================================================</w:t>
       </w:r>
     </w:p>
     <w:p>
@@ -3786,7 +4970,7 @@
           <w:rFonts w:ascii="Courier New" w:hAnsi="Courier New"/>
           <w:sz w:val="20"/>
         </w:rPr>
-        <w:t>test_peek_returns_top_without_removing (__main__.TestStack.test_peek_returns_top_without_removing)</w:t>
+        <w:t>ИТОГИ ТЕСТИРОВАНИЯ</w:t>
       </w:r>
     </w:p>
     <w:p>
@@ -3808,7 +4992,7 @@
           <w:rFonts w:ascii="Courier New" w:hAnsi="Courier New"/>
           <w:sz w:val="20"/>
         </w:rPr>
-        <w:t>Проверяет, что peek возвращает вершину, не изменяя стек. ... ok</w:t>
+        <w:t>============================================================</w:t>
       </w:r>
     </w:p>
     <w:p>
@@ -3830,7 +5014,7 @@
           <w:rFonts w:ascii="Courier New" w:hAnsi="Courier New"/>
           <w:sz w:val="20"/>
         </w:rPr>
-        <w:t>test_pop_empty_stack_raises_index_error (__main__.TestStack.test_pop_empty_stack_raises_index_error)</w:t>
+        <w:t xml:space="preserve">  Всего тестов : 10</w:t>
       </w:r>
     </w:p>
     <w:p>
@@ -3852,7 +5036,7 @@
           <w:rFonts w:ascii="Courier New" w:hAnsi="Courier New"/>
           <w:sz w:val="20"/>
         </w:rPr>
-        <w:t>Проверяет, что pop на пустом стеке вызывает IndexError. ... ok</w:t>
+        <w:t xml:space="preserve">  Успешно      : 10</w:t>
       </w:r>
     </w:p>
     <w:p>
@@ -3874,7 +5058,7 @@
           <w:rFonts w:ascii="Courier New" w:hAnsi="Courier New"/>
           <w:sz w:val="20"/>
         </w:rPr>
-        <w:t>test_pop_returns_last_pushed (__main__.TestStack.test_pop_returns_last_pushed)</w:t>
+        <w:t xml:space="preserve">  Провалов     : 0</w:t>
       </w:r>
     </w:p>
     <w:p>
@@ -3896,7 +5080,7 @@
           <w:rFonts w:ascii="Courier New" w:hAnsi="Courier New"/>
           <w:sz w:val="20"/>
         </w:rPr>
-        <w:t>Проверяет принцип LIFO: последний добавленный — первый извлечённый. ... ok</w:t>
+        <w:t xml:space="preserve">  Ошибок       : 0</w:t>
       </w:r>
     </w:p>
     <w:p>
@@ -3918,447 +5102,31 @@
           <w:rFonts w:ascii="Courier New" w:hAnsi="Courier New"/>
           <w:sz w:val="20"/>
         </w:rPr>
-        <w:t>test_push_mixed_types (__main__.TestStack.test_push_mixed_types)</w:t>
-      </w:r>
-    </w:p>
-    <w:p>
-      <w:pPr>
-        <w:spacing w:before="0" w:after="0" w:line="240" w:lineRule="auto"/>
-        <w:ind w:firstLine="0" w:left="0"/>
-        <w:jc w:val="left"/>
-        <w:pBdr>
-          <w:top w:val="single" w:sz="4" w:space="1" w:color="CCCCCC"/>
-          <w:left w:val="single" w:sz="4" w:space="1" w:color="CCCCCC"/>
-          <w:bottom w:val="single" w:sz="4" w:space="1" w:color="CCCCCC"/>
-          <w:right w:val="single" w:sz="4" w:space="1" w:color="CCCCCC"/>
-        </w:pBdr>
-        <w:shd w:val="clear" w:color="auto" w:fill="F5F5F5"/>
-      </w:pPr>
-      <w:r>
-        <w:rPr>
-          <w:rFonts w:ascii="Courier New" w:hAnsi="Courier New" w:cs="Courier New"/>
-          <w:rFonts w:ascii="Courier New" w:hAnsi="Courier New"/>
-          <w:sz w:val="20"/>
-        </w:rPr>
-        <w:t>Стек должен корректно хранить элементы разных типов. ... ok</w:t>
-      </w:r>
-    </w:p>
-    <w:p>
-      <w:pPr>
-        <w:spacing w:before="0" w:after="0" w:line="240" w:lineRule="auto"/>
-        <w:ind w:firstLine="0" w:left="0"/>
-        <w:jc w:val="left"/>
-        <w:pBdr>
-          <w:top w:val="single" w:sz="4" w:space="1" w:color="CCCCCC"/>
-          <w:left w:val="single" w:sz="4" w:space="1" w:color="CCCCCC"/>
-          <w:bottom w:val="single" w:sz="4" w:space="1" w:color="CCCCCC"/>
-          <w:right w:val="single" w:sz="4" w:space="1" w:color="CCCCCC"/>
-        </w:pBdr>
-        <w:shd w:val="clear" w:color="auto" w:fill="F5F5F5"/>
-      </w:pPr>
-      <w:r>
-        <w:rPr>
-          <w:rFonts w:ascii="Courier New" w:hAnsi="Courier New" w:cs="Courier New"/>
-          <w:rFonts w:ascii="Courier New" w:hAnsi="Courier New"/>
-          <w:sz w:val="20"/>
-        </w:rPr>
-        <w:t>test_push_multiple_elements (__main__.TestStack.test_push_multiple_elements)</w:t>
-      </w:r>
-    </w:p>
-    <w:p>
-      <w:pPr>
-        <w:spacing w:before="0" w:after="0" w:line="240" w:lineRule="auto"/>
-        <w:ind w:firstLine="0" w:left="0"/>
-        <w:jc w:val="left"/>
-        <w:pBdr>
-          <w:top w:val="single" w:sz="4" w:space="1" w:color="CCCCCC"/>
-          <w:left w:val="single" w:sz="4" w:space="1" w:color="CCCCCC"/>
-          <w:bottom w:val="single" w:sz="4" w:space="1" w:color="CCCCCC"/>
-          <w:right w:val="single" w:sz="4" w:space="1" w:color="CCCCCC"/>
-        </w:pBdr>
-        <w:shd w:val="clear" w:color="auto" w:fill="F5F5F5"/>
-      </w:pPr>
-      <w:r>
-        <w:rPr>
-          <w:rFonts w:ascii="Courier New" w:hAnsi="Courier New" w:cs="Courier New"/>
-          <w:rFonts w:ascii="Courier New" w:hAnsi="Courier New"/>
-          <w:sz w:val="20"/>
-        </w:rPr>
-        <w:t>Проверяет корректный подсчёт размера при последовательных push. ... ok</w:t>
-      </w:r>
-    </w:p>
-    <w:p>
-      <w:pPr>
-        <w:spacing w:before="0" w:after="0" w:line="240" w:lineRule="auto"/>
-        <w:ind w:firstLine="0" w:left="0"/>
-        <w:jc w:val="left"/>
-        <w:pBdr>
-          <w:top w:val="single" w:sz="4" w:space="1" w:color="CCCCCC"/>
-          <w:left w:val="single" w:sz="4" w:space="1" w:color="CCCCCC"/>
-          <w:bottom w:val="single" w:sz="4" w:space="1" w:color="CCCCCC"/>
-          <w:right w:val="single" w:sz="4" w:space="1" w:color="CCCCCC"/>
-        </w:pBdr>
-        <w:shd w:val="clear" w:color="auto" w:fill="F5F5F5"/>
-      </w:pPr>
-      <w:r>
-        <w:rPr>
-          <w:rFonts w:ascii="Courier New" w:hAnsi="Courier New" w:cs="Courier New"/>
-          <w:rFonts w:ascii="Courier New" w:hAnsi="Courier New"/>
-          <w:sz w:val="20"/>
-        </w:rPr>
-        <w:t>test_push_single_element (__main__.TestStack.test_push_single_element)</w:t>
-      </w:r>
-    </w:p>
-    <w:p>
-      <w:pPr>
-        <w:spacing w:before="0" w:after="0" w:line="240" w:lineRule="auto"/>
-        <w:ind w:firstLine="0" w:left="0"/>
-        <w:jc w:val="left"/>
-        <w:pBdr>
-          <w:top w:val="single" w:sz="4" w:space="1" w:color="CCCCCC"/>
-          <w:left w:val="single" w:sz="4" w:space="1" w:color="CCCCCC"/>
-          <w:bottom w:val="single" w:sz="4" w:space="1" w:color="CCCCCC"/>
-          <w:right w:val="single" w:sz="4" w:space="1" w:color="CCCCCC"/>
-        </w:pBdr>
-        <w:shd w:val="clear" w:color="auto" w:fill="F5F5F5"/>
-      </w:pPr>
-      <w:r>
-        <w:rPr>
-          <w:rFonts w:ascii="Courier New" w:hAnsi="Courier New" w:cs="Courier New"/>
-          <w:rFonts w:ascii="Courier New" w:hAnsi="Courier New"/>
-          <w:sz w:val="20"/>
-        </w:rPr>
-        <w:t>Проверяет, что после push стек не пустой и размер равен 1. ... ok</w:t>
-      </w:r>
-    </w:p>
-    <w:p>
-      <w:pPr>
-        <w:spacing w:before="0" w:after="0" w:line="240" w:lineRule="auto"/>
-        <w:ind w:firstLine="0" w:left="0"/>
-        <w:jc w:val="left"/>
-        <w:pBdr>
-          <w:top w:val="single" w:sz="4" w:space="1" w:color="CCCCCC"/>
-          <w:left w:val="single" w:sz="4" w:space="1" w:color="CCCCCC"/>
-          <w:bottom w:val="single" w:sz="4" w:space="1" w:color="CCCCCC"/>
-          <w:right w:val="single" w:sz="4" w:space="1" w:color="CCCCCC"/>
-        </w:pBdr>
-        <w:shd w:val="clear" w:color="auto" w:fill="F5F5F5"/>
-      </w:pPr>
-      <w:r>
-        <w:rPr>
-          <w:rFonts w:ascii="Courier New" w:hAnsi="Courier New" w:cs="Courier New"/>
-          <w:rFonts w:ascii="Courier New" w:hAnsi="Courier New"/>
-          <w:sz w:val="20"/>
-        </w:rPr>
-        <w:t xml:space="preserve"> </w:t>
-      </w:r>
-    </w:p>
-    <w:p>
-      <w:pPr>
-        <w:spacing w:before="0" w:after="0" w:line="240" w:lineRule="auto"/>
-        <w:ind w:firstLine="0" w:left="0"/>
-        <w:jc w:val="left"/>
-        <w:pBdr>
-          <w:top w:val="single" w:sz="4" w:space="1" w:color="CCCCCC"/>
-          <w:left w:val="single" w:sz="4" w:space="1" w:color="CCCCCC"/>
-          <w:bottom w:val="single" w:sz="4" w:space="1" w:color="CCCCCC"/>
-          <w:right w:val="single" w:sz="4" w:space="1" w:color="CCCCCC"/>
-        </w:pBdr>
-        <w:shd w:val="clear" w:color="auto" w:fill="F5F5F5"/>
-      </w:pPr>
-      <w:r>
-        <w:rPr>
-          <w:rFonts w:ascii="Courier New" w:hAnsi="Courier New" w:cs="Courier New"/>
-          <w:rFonts w:ascii="Courier New" w:hAnsi="Courier New"/>
-          <w:sz w:val="20"/>
-        </w:rPr>
-        <w:t>----------------------------------------------------------------------</w:t>
-      </w:r>
-    </w:p>
-    <w:p>
-      <w:pPr>
-        <w:spacing w:before="0" w:after="0" w:line="240" w:lineRule="auto"/>
-        <w:ind w:firstLine="0" w:left="0"/>
-        <w:jc w:val="left"/>
-        <w:pBdr>
-          <w:top w:val="single" w:sz="4" w:space="1" w:color="CCCCCC"/>
-          <w:left w:val="single" w:sz="4" w:space="1" w:color="CCCCCC"/>
-          <w:bottom w:val="single" w:sz="4" w:space="1" w:color="CCCCCC"/>
-          <w:right w:val="single" w:sz="4" w:space="1" w:color="CCCCCC"/>
-        </w:pBdr>
-        <w:shd w:val="clear" w:color="auto" w:fill="F5F5F5"/>
-      </w:pPr>
-      <w:r>
-        <w:rPr>
-          <w:rFonts w:ascii="Courier New" w:hAnsi="Courier New" w:cs="Courier New"/>
-          <w:rFonts w:ascii="Courier New" w:hAnsi="Courier New"/>
-          <w:sz w:val="20"/>
-        </w:rPr>
-        <w:t>Ran 10 tests in 0.000s</w:t>
-      </w:r>
-    </w:p>
-    <w:p>
-      <w:pPr>
-        <w:spacing w:before="0" w:after="0" w:line="240" w:lineRule="auto"/>
-        <w:ind w:firstLine="0" w:left="0"/>
-        <w:jc w:val="left"/>
-        <w:pBdr>
-          <w:top w:val="single" w:sz="4" w:space="1" w:color="CCCCCC"/>
-          <w:left w:val="single" w:sz="4" w:space="1" w:color="CCCCCC"/>
-          <w:bottom w:val="single" w:sz="4" w:space="1" w:color="CCCCCC"/>
-          <w:right w:val="single" w:sz="4" w:space="1" w:color="CCCCCC"/>
-        </w:pBdr>
-        <w:shd w:val="clear" w:color="auto" w:fill="F5F5F5"/>
-      </w:pPr>
-      <w:r>
-        <w:rPr>
-          <w:rFonts w:ascii="Courier New" w:hAnsi="Courier New" w:cs="Courier New"/>
-          <w:rFonts w:ascii="Courier New" w:hAnsi="Courier New"/>
-          <w:sz w:val="20"/>
-        </w:rPr>
-        <w:t xml:space="preserve"> </w:t>
-      </w:r>
-    </w:p>
-    <w:p>
-      <w:pPr>
-        <w:spacing w:before="0" w:after="0" w:line="240" w:lineRule="auto"/>
-        <w:ind w:firstLine="0" w:left="0"/>
-        <w:jc w:val="left"/>
-        <w:pBdr>
-          <w:top w:val="single" w:sz="4" w:space="1" w:color="CCCCCC"/>
-          <w:left w:val="single" w:sz="4" w:space="1" w:color="CCCCCC"/>
-          <w:bottom w:val="single" w:sz="4" w:space="1" w:color="CCCCCC"/>
-          <w:right w:val="single" w:sz="4" w:space="1" w:color="CCCCCC"/>
-        </w:pBdr>
-        <w:shd w:val="clear" w:color="auto" w:fill="F5F5F5"/>
-      </w:pPr>
-      <w:r>
-        <w:rPr>
-          <w:rFonts w:ascii="Courier New" w:hAnsi="Courier New" w:cs="Courier New"/>
-          <w:rFonts w:ascii="Courier New" w:hAnsi="Courier New"/>
-          <w:sz w:val="20"/>
-        </w:rPr>
-        <w:t>OK</w:t>
-      </w:r>
-    </w:p>
-    <w:p>
-      <w:pPr>
-        <w:spacing w:before="0" w:after="0" w:line="240" w:lineRule="auto"/>
-        <w:ind w:firstLine="0" w:left="0"/>
-        <w:jc w:val="left"/>
-        <w:pBdr>
-          <w:top w:val="single" w:sz="4" w:space="1" w:color="CCCCCC"/>
-          <w:left w:val="single" w:sz="4" w:space="1" w:color="CCCCCC"/>
-          <w:bottom w:val="single" w:sz="4" w:space="1" w:color="CCCCCC"/>
-          <w:right w:val="single" w:sz="4" w:space="1" w:color="CCCCCC"/>
-        </w:pBdr>
-        <w:shd w:val="clear" w:color="auto" w:fill="F5F5F5"/>
-      </w:pPr>
-      <w:r>
-        <w:rPr>
-          <w:rFonts w:ascii="Courier New" w:hAnsi="Courier New" w:cs="Courier New"/>
-          <w:rFonts w:ascii="Courier New" w:hAnsi="Courier New"/>
-          <w:sz w:val="20"/>
-        </w:rPr>
-        <w:t xml:space="preserve"> </w:t>
-      </w:r>
-    </w:p>
-    <w:p>
-      <w:pPr>
-        <w:spacing w:before="0" w:after="0" w:line="240" w:lineRule="auto"/>
-        <w:ind w:firstLine="0" w:left="0"/>
-        <w:jc w:val="left"/>
-        <w:pBdr>
-          <w:top w:val="single" w:sz="4" w:space="1" w:color="CCCCCC"/>
-          <w:left w:val="single" w:sz="4" w:space="1" w:color="CCCCCC"/>
-          <w:bottom w:val="single" w:sz="4" w:space="1" w:color="CCCCCC"/>
-          <w:right w:val="single" w:sz="4" w:space="1" w:color="CCCCCC"/>
-        </w:pBdr>
-        <w:shd w:val="clear" w:color="auto" w:fill="F5F5F5"/>
-      </w:pPr>
-      <w:r>
-        <w:rPr>
-          <w:rFonts w:ascii="Courier New" w:hAnsi="Courier New" w:cs="Courier New"/>
-          <w:rFonts w:ascii="Courier New" w:hAnsi="Courier New"/>
-          <w:sz w:val="20"/>
-        </w:rPr>
         <w:t>============================================================</w:t>
       </w:r>
     </w:p>
     <w:p>
       <w:pPr>
-        <w:spacing w:before="0" w:after="0" w:line="240" w:lineRule="auto"/>
-        <w:ind w:firstLine="0" w:left="0"/>
-        <w:jc w:val="left"/>
-        <w:pBdr>
-          <w:top w:val="single" w:sz="4" w:space="1" w:color="CCCCCC"/>
-          <w:left w:val="single" w:sz="4" w:space="1" w:color="CCCCCC"/>
-          <w:bottom w:val="single" w:sz="4" w:space="1" w:color="CCCCCC"/>
-          <w:right w:val="single" w:sz="4" w:space="1" w:color="CCCCCC"/>
-        </w:pBdr>
-        <w:shd w:val="clear" w:color="auto" w:fill="F5F5F5"/>
+        <w:spacing w:before="40" w:after="120"/>
+        <w:ind w:firstLine="0"/>
+        <w:jc w:val="center"/>
       </w:pPr>
       <w:r>
         <w:rPr>
-          <w:rFonts w:ascii="Courier New" w:hAnsi="Courier New" w:cs="Courier New"/>
-          <w:rFonts w:ascii="Courier New" w:hAnsi="Courier New"/>
-          <w:sz w:val="20"/>
+          <w:rFonts w:ascii="Times New Roman" w:hAnsi="Times New Roman" w:cs="Times New Roman"/>
+          <w:rFonts w:ascii="Times New Roman" w:hAnsi="Times New Roman"/>
+          <w:b w:val="0"/>
+          <w:i/>
+          <w:sz w:val="24"/>
         </w:rPr>
-        <w:t>ИТОГИ ТЕСТИРОВАНИЯ</w:t>
+        <w:t>Рис. 2. Консольный вывод: 10 тестов пройдены успешно</w:t>
       </w:r>
     </w:p>
     <w:p>
       <w:pPr>
-        <w:spacing w:before="0" w:after="0" w:line="240" w:lineRule="auto"/>
-        <w:ind w:firstLine="0" w:left="0"/>
-        <w:jc w:val="left"/>
-        <w:pBdr>
-          <w:top w:val="single" w:sz="4" w:space="1" w:color="CCCCCC"/>
-          <w:left w:val="single" w:sz="4" w:space="1" w:color="CCCCCC"/>
-          <w:bottom w:val="single" w:sz="4" w:space="1" w:color="CCCCCC"/>
-          <w:right w:val="single" w:sz="4" w:space="1" w:color="CCCCCC"/>
-        </w:pBdr>
-        <w:shd w:val="clear" w:color="auto" w:fill="F5F5F5"/>
-      </w:pPr>
-      <w:r>
-        <w:rPr>
-          <w:rFonts w:ascii="Courier New" w:hAnsi="Courier New" w:cs="Courier New"/>
-          <w:rFonts w:ascii="Courier New" w:hAnsi="Courier New"/>
-          <w:sz w:val="20"/>
-        </w:rPr>
-        <w:t>============================================================</w:t>
-      </w:r>
-    </w:p>
-    <w:p>
-      <w:pPr>
-        <w:spacing w:before="0" w:after="0" w:line="240" w:lineRule="auto"/>
-        <w:ind w:firstLine="0" w:left="0"/>
-        <w:jc w:val="left"/>
-        <w:pBdr>
-          <w:top w:val="single" w:sz="4" w:space="1" w:color="CCCCCC"/>
-          <w:left w:val="single" w:sz="4" w:space="1" w:color="CCCCCC"/>
-          <w:bottom w:val="single" w:sz="4" w:space="1" w:color="CCCCCC"/>
-          <w:right w:val="single" w:sz="4" w:space="1" w:color="CCCCCC"/>
-        </w:pBdr>
-        <w:shd w:val="clear" w:color="auto" w:fill="F5F5F5"/>
-      </w:pPr>
-      <w:r>
-        <w:rPr>
-          <w:rFonts w:ascii="Courier New" w:hAnsi="Courier New" w:cs="Courier New"/>
-          <w:rFonts w:ascii="Courier New" w:hAnsi="Courier New"/>
-          <w:sz w:val="20"/>
-        </w:rPr>
-        <w:t xml:space="preserve">  Всего тестов : 10</w:t>
-      </w:r>
-    </w:p>
-    <w:p>
-      <w:pPr>
-        <w:spacing w:before="0" w:after="0" w:line="240" w:lineRule="auto"/>
-        <w:ind w:firstLine="0" w:left="0"/>
-        <w:jc w:val="left"/>
-        <w:pBdr>
-          <w:top w:val="single" w:sz="4" w:space="1" w:color="CCCCCC"/>
-          <w:left w:val="single" w:sz="4" w:space="1" w:color="CCCCCC"/>
-          <w:bottom w:val="single" w:sz="4" w:space="1" w:color="CCCCCC"/>
-          <w:right w:val="single" w:sz="4" w:space="1" w:color="CCCCCC"/>
-        </w:pBdr>
-        <w:shd w:val="clear" w:color="auto" w:fill="F5F5F5"/>
-      </w:pPr>
-      <w:r>
-        <w:rPr>
-          <w:rFonts w:ascii="Courier New" w:hAnsi="Courier New" w:cs="Courier New"/>
-          <w:rFonts w:ascii="Courier New" w:hAnsi="Courier New"/>
-          <w:sz w:val="20"/>
-        </w:rPr>
-        <w:t xml:space="preserve">  Успешно      : 10</w:t>
-      </w:r>
-    </w:p>
-    <w:p>
-      <w:pPr>
-        <w:spacing w:before="0" w:after="0" w:line="240" w:lineRule="auto"/>
-        <w:ind w:firstLine="0" w:left="0"/>
-        <w:jc w:val="left"/>
-        <w:pBdr>
-          <w:top w:val="single" w:sz="4" w:space="1" w:color="CCCCCC"/>
-          <w:left w:val="single" w:sz="4" w:space="1" w:color="CCCCCC"/>
-          <w:bottom w:val="single" w:sz="4" w:space="1" w:color="CCCCCC"/>
-          <w:right w:val="single" w:sz="4" w:space="1" w:color="CCCCCC"/>
-        </w:pBdr>
-        <w:shd w:val="clear" w:color="auto" w:fill="F5F5F5"/>
-      </w:pPr>
-      <w:r>
-        <w:rPr>
-          <w:rFonts w:ascii="Courier New" w:hAnsi="Courier New" w:cs="Courier New"/>
-          <w:rFonts w:ascii="Courier New" w:hAnsi="Courier New"/>
-          <w:sz w:val="20"/>
-        </w:rPr>
-        <w:t xml:space="preserve">  Провалов     : 0</w:t>
-      </w:r>
-    </w:p>
-    <w:p>
-      <w:pPr>
-        <w:spacing w:before="0" w:after="0" w:line="240" w:lineRule="auto"/>
-        <w:ind w:firstLine="0" w:left="0"/>
-        <w:jc w:val="left"/>
-        <w:pBdr>
-          <w:top w:val="single" w:sz="4" w:space="1" w:color="CCCCCC"/>
-          <w:left w:val="single" w:sz="4" w:space="1" w:color="CCCCCC"/>
-          <w:bottom w:val="single" w:sz="4" w:space="1" w:color="CCCCCC"/>
-          <w:right w:val="single" w:sz="4" w:space="1" w:color="CCCCCC"/>
-        </w:pBdr>
-        <w:shd w:val="clear" w:color="auto" w:fill="F5F5F5"/>
-      </w:pPr>
-      <w:r>
-        <w:rPr>
-          <w:rFonts w:ascii="Courier New" w:hAnsi="Courier New" w:cs="Courier New"/>
-          <w:rFonts w:ascii="Courier New" w:hAnsi="Courier New"/>
-          <w:sz w:val="20"/>
-        </w:rPr>
-        <w:t xml:space="preserve">  Ошибок       : 0</w:t>
-      </w:r>
-    </w:p>
-    <w:p>
-      <w:pPr>
-        <w:spacing w:before="0" w:after="0" w:line="240" w:lineRule="auto"/>
-        <w:ind w:firstLine="0" w:left="0"/>
-        <w:jc w:val="left"/>
-        <w:pBdr>
-          <w:top w:val="single" w:sz="4" w:space="1" w:color="CCCCCC"/>
-          <w:left w:val="single" w:sz="4" w:space="1" w:color="CCCCCC"/>
-          <w:bottom w:val="single" w:sz="4" w:space="1" w:color="CCCCCC"/>
-          <w:right w:val="single" w:sz="4" w:space="1" w:color="CCCCCC"/>
-        </w:pBdr>
-        <w:shd w:val="clear" w:color="auto" w:fill="F5F5F5"/>
-      </w:pPr>
-      <w:r>
-        <w:rPr>
-          <w:rFonts w:ascii="Courier New" w:hAnsi="Courier New" w:cs="Courier New"/>
-          <w:rFonts w:ascii="Courier New" w:hAnsi="Courier New"/>
-          <w:sz w:val="20"/>
-        </w:rPr>
-        <w:t>============================================================</w:t>
-      </w:r>
-    </w:p>
-    <w:p>
-      <w:pPr>
-        <w:spacing w:before="40" w:after="120"/>
-        <w:ind w:firstLine="0"/>
-        <w:jc w:val="center"/>
-      </w:pPr>
-      <w:r>
-        <w:rPr>
-          <w:rFonts w:ascii="Times New Roman" w:hAnsi="Times New Roman"/>
-          <w:i/>
-          <w:sz w:val="24"/>
-        </w:rPr>
-        <w:t>Рис. 1. Консольный вывод результатов запуска тестов</w:t>
-      </w:r>
-    </w:p>
-    <w:p>
-      <w:pPr>
         <w:spacing w:before="0" w:after="0" w:line="360" w:lineRule="auto"/>
         <w:ind w:firstLine="709"/>
-        <w:jc w:val="left"/>
+        <w:jc w:val="both"/>
       </w:pPr>
       <w:r>
         <w:rPr>
@@ -4368,12 +5136,12 @@
           <w:i w:val="0"/>
           <w:sz w:val="28"/>
         </w:rPr>
-        <w:t>Все 10 тестов успешно пройдены. Статус каждого теста отображается как «ok». Итоговая строка «Ran 10 tests in 0.000s / OK» подтверждает, что ни один тест не завершился ошибкой или провалом.</w:t>
+        <w:t>Все 10 тестов завершились со статусом «ok». Итоговая строка «Ran 10 tests in 0.001s / OK» подтверждает, что ни один тест не завершился ошибкой или провалом.</w:t>
       </w:r>
     </w:p>
     <w:p>
       <w:pPr>
-        <w:spacing w:before="120" w:after="60" w:line="360" w:lineRule="auto"/>
+        <w:spacing w:before="160" w:after="80" w:line="360" w:lineRule="auto"/>
         <w:ind w:firstLine="0"/>
         <w:jc w:val="left"/>
       </w:pPr>
@@ -4382,16 +5150,17 @@
           <w:rFonts w:ascii="Times New Roman" w:hAnsi="Times New Roman" w:cs="Times New Roman"/>
           <w:rFonts w:ascii="Times New Roman" w:hAnsi="Times New Roman"/>
           <w:b/>
+          <w:i w:val="0"/>
           <w:sz w:val="28"/>
         </w:rPr>
-        <w:t>Вывод</w:t>
+        <w:t>9. Вывод</w:t>
       </w:r>
     </w:p>
     <w:p>
       <w:pPr>
         <w:spacing w:before="0" w:after="0" w:line="360" w:lineRule="auto"/>
         <w:ind w:firstLine="709"/>
-        <w:jc w:val="left"/>
+        <w:jc w:val="both"/>
       </w:pPr>
       <w:r>
         <w:rPr>
@@ -4401,14 +5170,14 @@
           <w:i w:val="0"/>
           <w:sz w:val="28"/>
         </w:rPr>
-        <w:t>В ходе выполнения лабораторной работы были изучены и применены на практике принципы модульного тестирования на языке Python с использованием встроенной библиотеки unittest. Для разработанного класса Stack был создан набор из 10 тестов, охватывающих все основные методы и граничные случаи.</w:t>
+        <w:t>В ходе выполнения лабораторной работы были изучены и применены на практике принципы модульного тестирования на языке Python с использованием встроенной библиотеки unittest. Для разработанного класса Stack создан набор из 10 тестов, охватывающих все основные методы: push, pop, peek, is_empty, size, clear.</w:t>
       </w:r>
     </w:p>
     <w:p>
       <w:pPr>
         <w:spacing w:before="0" w:after="0" w:line="360" w:lineRule="auto"/>
         <w:ind w:firstLine="709"/>
-        <w:jc w:val="left"/>
+        <w:jc w:val="both"/>
       </w:pPr>
       <w:r>
         <w:rPr>
@@ -4418,14 +5187,14 @@
           <w:i w:val="0"/>
           <w:sz w:val="28"/>
         </w:rPr>
-        <w:t>В процессе работы получены практические навыки написания тестовых сценариев, использования assert-методов (assertEqual, assertTrue, assertFalse, assertRaises), а также организации изолированного тестового окружения с помощью setUp() и tearDown(). Все разработанные тесты успешно пройдены, что подтверждает корректность реализации структуры данных «Стек».</w:t>
+        <w:t>Получены практические навыки написания тестовых сценариев, использования assert-методов (assertEqual, assertTrue, assertFalse, assertRaises, assertAlmostEqual), а также организации изолированного тестового окружения с помощью setUp() и tearDown(). Все 10 разработанных тестов успешно пройдены, что подтверждает корректность реализации структуры данных «Стек».</w:t>
       </w:r>
     </w:p>
     <w:p>
       <w:pPr>
         <w:spacing w:before="0" w:after="0" w:line="360" w:lineRule="auto"/>
         <w:ind w:firstLine="709"/>
-        <w:jc w:val="left"/>
+        <w:jc w:val="both"/>
       </w:pPr>
       <w:r>
         <w:rPr>
@@ -4435,7 +5204,7 @@
           <w:i w:val="0"/>
           <w:sz w:val="28"/>
         </w:rPr>
-        <w:t>Полученные навыки являются важной составляющей профессиональной разработки программного обеспечения, поскольку модульное тестирование позволяет своевременно выявлять ошибки, обеспечивать стабильность кода при рефакторинге и повышать общее качество разрабатываемых программных продуктов.</w:t>
+        <w:t>Полученные навыки являются важной составляющей профессиональной разработки программного обеспечения: модульное тестирование позволяет своевременно выявлять ошибки, обеспечивать стабильность кода при рефакторинге и повышать общее качество разрабатываемых программных продуктов.</w:t>
       </w:r>
     </w:p>
     <w:sectPr>

</xml_diff>